<commit_message>
Added Coin Pick Up sound effect
</commit_message>
<xml_diff>
--- a/Assessment/Track Sheet.docx
+++ b/Assessment/Track Sheet.docx
@@ -821,6 +821,638 @@
         </w:rPr>
       </w:pPr>
     </w:p>
+    <w:tbl>
+      <w:tblPr>
+        <w:tblStyle w:val="TableGrid"/>
+        <w:tblW w:w="10485" w:type="dxa"/>
+        <w:tblLayout w:type="fixed"/>
+        <w:tblLook w:val="04A0" w:firstRow="1" w:lastRow="0" w:firstColumn="1" w:lastColumn="0" w:noHBand="0" w:noVBand="1"/>
+      </w:tblPr>
+      <w:tblGrid>
+        <w:gridCol w:w="2621"/>
+        <w:gridCol w:w="2621"/>
+        <w:gridCol w:w="2621"/>
+        <w:gridCol w:w="2622"/>
+      </w:tblGrid>
+      <w:tr>
+        <w:tc>
+          <w:tcPr>
+            <w:tcW w:w="10485" w:type="dxa"/>
+            <w:gridSpan w:val="4"/>
+            <w:shd w:val="clear" w:color="auto" w:fill="DAE9F7" w:themeFill="text2" w:themeFillTint="1A"/>
+          </w:tcPr>
+          <w:p>
+            <w:pPr>
+              <w:jc w:val="center"/>
+              <w:rPr>
+                <w:rFonts w:ascii="Calibri" w:hAnsi="Calibri" w:cs="Calibri"/>
+                <w:b/>
+                <w:bCs/>
+                <w:color w:val="215E99" w:themeColor="text2" w:themeTint="BF"/>
+                <w:sz w:val="32"/>
+                <w:szCs w:val="32"/>
+              </w:rPr>
+            </w:pPr>
+            <w:r>
+              <w:rPr>
+                <w:rFonts w:ascii="Calibri" w:hAnsi="Calibri" w:cs="Calibri"/>
+                <w:b/>
+                <w:bCs/>
+                <w:color w:val="215E99" w:themeColor="text2" w:themeTint="BF"/>
+                <w:sz w:val="32"/>
+                <w:szCs w:val="32"/>
+              </w:rPr>
+              <w:t>Pick up SFXs</w:t>
+            </w:r>
+          </w:p>
+        </w:tc>
+      </w:tr>
+      <w:tr>
+        <w:tc>
+          <w:tcPr>
+            <w:tcW w:w="10485" w:type="dxa"/>
+            <w:gridSpan w:val="4"/>
+          </w:tcPr>
+          <w:p>
+            <w:pPr>
+              <w:rPr>
+                <w:rFonts w:ascii="Calibri" w:hAnsi="Calibri" w:cs="Calibri"/>
+                <w:color w:val="000000" w:themeColor="text1"/>
+              </w:rPr>
+            </w:pPr>
+            <w:r>
+              <w:rPr>
+                <w:rFonts w:ascii="Calibri" w:hAnsi="Calibri" w:cs="Calibri"/>
+                <w:color w:val="000000" w:themeColor="text1"/>
+              </w:rPr>
+              <w:t>The sound effects made when a specific item is picked up. Includes coins and hearts.</w:t>
+            </w:r>
+          </w:p>
+        </w:tc>
+      </w:tr>
+      <w:tr>
+        <w:tc>
+          <w:tcPr>
+            <w:tcW w:w="2621" w:type="dxa"/>
+            <w:shd w:val="clear" w:color="auto" w:fill="DAE9F7" w:themeFill="text2" w:themeFillTint="1A"/>
+          </w:tcPr>
+          <w:p>
+            <w:pPr>
+              <w:rPr>
+                <w:rFonts w:ascii="Calibri" w:hAnsi="Calibri" w:cs="Calibri"/>
+                <w:color w:val="215E99" w:themeColor="text2" w:themeTint="BF"/>
+              </w:rPr>
+            </w:pPr>
+            <w:r>
+              <w:rPr>
+                <w:rFonts w:ascii="Calibri" w:hAnsi="Calibri" w:cs="Calibri"/>
+                <w:color w:val="215E99" w:themeColor="text2" w:themeTint="BF"/>
+              </w:rPr>
+              <w:t>Source files</w:t>
+            </w:r>
+          </w:p>
+        </w:tc>
+        <w:tc>
+          <w:tcPr>
+            <w:tcW w:w="2621" w:type="dxa"/>
+            <w:shd w:val="clear" w:color="auto" w:fill="DAE9F7" w:themeFill="text2" w:themeFillTint="1A"/>
+          </w:tcPr>
+          <w:p>
+            <w:pPr>
+              <w:rPr>
+                <w:rFonts w:ascii="Calibri" w:hAnsi="Calibri" w:cs="Calibri"/>
+                <w:color w:val="215E99" w:themeColor="text2" w:themeTint="BF"/>
+              </w:rPr>
+            </w:pPr>
+            <w:r>
+              <w:rPr>
+                <w:rFonts w:ascii="Calibri" w:hAnsi="Calibri" w:cs="Calibri"/>
+                <w:color w:val="215E99" w:themeColor="text2" w:themeTint="BF"/>
+              </w:rPr>
+              <w:t>Editing performed</w:t>
+            </w:r>
+          </w:p>
+        </w:tc>
+        <w:tc>
+          <w:tcPr>
+            <w:tcW w:w="2621" w:type="dxa"/>
+            <w:shd w:val="clear" w:color="auto" w:fill="DAE9F7" w:themeFill="text2" w:themeFillTint="1A"/>
+          </w:tcPr>
+          <w:p>
+            <w:pPr>
+              <w:rPr>
+                <w:rFonts w:ascii="Calibri" w:hAnsi="Calibri" w:cs="Calibri"/>
+                <w:color w:val="215E99" w:themeColor="text2" w:themeTint="BF"/>
+              </w:rPr>
+            </w:pPr>
+            <w:r>
+              <w:rPr>
+                <w:rFonts w:ascii="Calibri" w:hAnsi="Calibri" w:cs="Calibri"/>
+                <w:color w:val="215E99" w:themeColor="text2" w:themeTint="BF"/>
+              </w:rPr>
+              <w:t>Effects applied</w:t>
+            </w:r>
+          </w:p>
+        </w:tc>
+        <w:tc>
+          <w:tcPr>
+            <w:tcW w:w="2622" w:type="dxa"/>
+            <w:shd w:val="clear" w:color="auto" w:fill="DAE9F7" w:themeFill="text2" w:themeFillTint="1A"/>
+          </w:tcPr>
+          <w:p>
+            <w:pPr>
+              <w:rPr>
+                <w:rFonts w:ascii="Calibri" w:hAnsi="Calibri" w:cs="Calibri"/>
+                <w:color w:val="215E99" w:themeColor="text2" w:themeTint="BF"/>
+              </w:rPr>
+            </w:pPr>
+            <w:r>
+              <w:rPr>
+                <w:rFonts w:ascii="Calibri" w:hAnsi="Calibri" w:cs="Calibri"/>
+                <w:color w:val="215E99" w:themeColor="text2" w:themeTint="BF"/>
+              </w:rPr>
+              <w:t>Comments</w:t>
+            </w:r>
+          </w:p>
+        </w:tc>
+      </w:tr>
+      <w:tr>
+        <w:tc>
+          <w:tcPr>
+            <w:tcW w:w="2621" w:type="dxa"/>
+          </w:tcPr>
+          <w:p>
+            <w:pPr>
+              <w:rPr>
+                <w:rFonts w:ascii="Calibri" w:hAnsi="Calibri" w:cs="Calibri"/>
+                <w:sz w:val="20"/>
+                <w:szCs w:val="20"/>
+              </w:rPr>
+            </w:pPr>
+            <w:r>
+              <w:rPr>
+                <w:rFonts w:ascii="Calibri" w:hAnsi="Calibri" w:cs="Calibri"/>
+                <w:sz w:val="20"/>
+                <w:szCs w:val="20"/>
+              </w:rPr>
+              <w:t>Coin Pick Up.mp3</w:t>
+            </w:r>
+          </w:p>
+        </w:tc>
+        <w:tc>
+          <w:tcPr>
+            <w:tcW w:w="2621" w:type="dxa"/>
+          </w:tcPr>
+          <w:p>
+            <w:pPr>
+              <w:rPr>
+                <w:rFonts w:ascii="Calibri" w:hAnsi="Calibri" w:cs="Calibri"/>
+                <w:sz w:val="20"/>
+                <w:szCs w:val="20"/>
+              </w:rPr>
+            </w:pPr>
+            <w:r>
+              <w:rPr>
+                <w:rFonts w:ascii="Calibri" w:hAnsi="Calibri" w:cs="Calibri"/>
+                <w:sz w:val="20"/>
+                <w:szCs w:val="20"/>
+              </w:rPr>
+              <w:t>Trimmed clip to remove silence and select best “ping”.</w:t>
+            </w:r>
+          </w:p>
+          <w:p>
+            <w:pPr>
+              <w:rPr>
+                <w:rFonts w:ascii="Calibri" w:hAnsi="Calibri" w:cs="Calibri"/>
+                <w:sz w:val="20"/>
+                <w:szCs w:val="20"/>
+              </w:rPr>
+            </w:pPr>
+          </w:p>
+          <w:p>
+            <w:pPr>
+              <w:rPr>
+                <w:rFonts w:ascii="Calibri" w:hAnsi="Calibri" w:cs="Calibri"/>
+                <w:sz w:val="20"/>
+                <w:szCs w:val="20"/>
+              </w:rPr>
+            </w:pPr>
+            <w:r>
+              <w:rPr>
+                <w:rFonts w:ascii="Calibri" w:hAnsi="Calibri" w:cs="Calibri"/>
+                <w:sz w:val="20"/>
+                <w:szCs w:val="20"/>
+              </w:rPr>
+              <w:t xml:space="preserve">Duplicated clip with +-0.5 semitone pitch difference. </w:t>
+            </w:r>
+          </w:p>
+          <w:p>
+            <w:pPr>
+              <w:rPr>
+                <w:rFonts w:ascii="Calibri" w:hAnsi="Calibri" w:cs="Calibri"/>
+                <w:sz w:val="20"/>
+                <w:szCs w:val="20"/>
+              </w:rPr>
+            </w:pPr>
+            <w:r>
+              <w:rPr>
+                <w:rFonts w:ascii="Calibri" w:hAnsi="Calibri" w:cs="Calibri"/>
+                <w:sz w:val="20"/>
+                <w:szCs w:val="20"/>
+              </w:rPr>
+              <w:t>(Randomly plays one of these when picking up the coin to avoid repetitive sound)</w:t>
+            </w:r>
+          </w:p>
+        </w:tc>
+        <w:tc>
+          <w:tcPr>
+            <w:tcW w:w="2621" w:type="dxa"/>
+          </w:tcPr>
+          <w:p>
+            <w:pPr>
+              <w:rPr>
+                <w:rFonts w:ascii="Calibri" w:hAnsi="Calibri" w:cs="Calibri"/>
+                <w:sz w:val="20"/>
+                <w:szCs w:val="20"/>
+              </w:rPr>
+            </w:pPr>
+            <w:r>
+              <w:rPr>
+                <w:rFonts w:ascii="Calibri" w:hAnsi="Calibri" w:cs="Calibri"/>
+                <w:sz w:val="20"/>
+                <w:szCs w:val="20"/>
+              </w:rPr>
+              <w:t xml:space="preserve">Applied reverb: </w:t>
+            </w:r>
+            <w:r>
+              <w:rPr>
+                <w:rFonts w:ascii="Calibri" w:hAnsi="Calibri" w:cs="Calibri"/>
+                <w:sz w:val="20"/>
+                <w:szCs w:val="20"/>
+              </w:rPr>
+              <w:drawing>
+                <wp:inline distT="0" distB="0" distL="0" distR="0" wp14:anchorId="365934D2" wp14:editId="174C3130">
+                  <wp:extent cx="1527175" cy="1960245"/>
+                  <wp:effectExtent l="0" t="0" r="0" b="1905"/>
+                  <wp:docPr id="361604459" name="Picture 1"/>
+                  <wp:cNvGraphicFramePr>
+                    <a:graphicFrameLocks xmlns:a="http://schemas.openxmlformats.org/drawingml/2006/main" noChangeAspect="1"/>
+                  </wp:cNvGraphicFramePr>
+                  <a:graphic xmlns:a="http://schemas.openxmlformats.org/drawingml/2006/main">
+                    <a:graphicData uri="http://schemas.openxmlformats.org/drawingml/2006/picture">
+                      <pic:pic xmlns:pic="http://schemas.openxmlformats.org/drawingml/2006/picture">
+                        <pic:nvPicPr>
+                          <pic:cNvPr id="361604459" name=""/>
+                          <pic:cNvPicPr/>
+                        </pic:nvPicPr>
+                        <pic:blipFill>
+                          <a:blip r:embed="rId4"/>
+                          <a:stretch>
+                            <a:fillRect/>
+                          </a:stretch>
+                        </pic:blipFill>
+                        <pic:spPr>
+                          <a:xfrm>
+                            <a:off x="0" y="0"/>
+                            <a:ext cx="1527175" cy="1960245"/>
+                          </a:xfrm>
+                          <a:prstGeom prst="rect">
+                            <a:avLst/>
+                          </a:prstGeom>
+                        </pic:spPr>
+                      </pic:pic>
+                    </a:graphicData>
+                  </a:graphic>
+                </wp:inline>
+              </w:drawing>
+            </w:r>
+          </w:p>
+          <w:p>
+            <w:pPr>
+              <w:rPr>
+                <w:rFonts w:ascii="Calibri" w:hAnsi="Calibri" w:cs="Calibri"/>
+                <w:sz w:val="20"/>
+                <w:szCs w:val="20"/>
+              </w:rPr>
+            </w:pPr>
+          </w:p>
+          <w:p>
+            <w:pPr>
+              <w:rPr>
+                <w:rFonts w:ascii="Calibri" w:hAnsi="Calibri" w:cs="Calibri"/>
+                <w:sz w:val="20"/>
+                <w:szCs w:val="20"/>
+              </w:rPr>
+            </w:pPr>
+            <w:r>
+              <w:rPr>
+                <w:rFonts w:ascii="Calibri" w:hAnsi="Calibri" w:cs="Calibri"/>
+                <w:sz w:val="20"/>
+                <w:szCs w:val="20"/>
+              </w:rPr>
+              <w:t>Pitch raised by 3 semitones</w:t>
+            </w:r>
+            <w:r>
+              <w:rPr>
+                <w:rFonts w:ascii="Calibri" w:hAnsi="Calibri" w:cs="Calibri"/>
+                <w:sz w:val="20"/>
+                <w:szCs w:val="20"/>
+              </w:rPr>
+              <w:t>.</w:t>
+            </w:r>
+          </w:p>
+          <w:p>
+            <w:pPr>
+              <w:rPr>
+                <w:rFonts w:ascii="Calibri" w:hAnsi="Calibri" w:cs="Calibri"/>
+                <w:sz w:val="20"/>
+                <w:szCs w:val="20"/>
+              </w:rPr>
+            </w:pPr>
+          </w:p>
+          <w:p>
+            <w:pPr>
+              <w:rPr>
+                <w:rFonts w:ascii="Calibri" w:hAnsi="Calibri" w:cs="Calibri"/>
+                <w:sz w:val="20"/>
+                <w:szCs w:val="20"/>
+              </w:rPr>
+            </w:pPr>
+            <w:r>
+              <w:rPr>
+                <w:rFonts w:ascii="Calibri" w:hAnsi="Calibri" w:cs="Calibri"/>
+                <w:sz w:val="20"/>
+                <w:szCs w:val="20"/>
+              </w:rPr>
+              <w:t>Applied filter curve EQ to remove low rumble</w:t>
+            </w:r>
+          </w:p>
+          <w:p>
+            <w:pPr>
+              <w:rPr>
+                <w:rFonts w:ascii="Calibri" w:hAnsi="Calibri" w:cs="Calibri"/>
+                <w:sz w:val="20"/>
+                <w:szCs w:val="20"/>
+              </w:rPr>
+            </w:pPr>
+          </w:p>
+          <w:p>
+            <w:pPr>
+              <w:rPr>
+                <w:rFonts w:ascii="Calibri" w:hAnsi="Calibri" w:cs="Calibri"/>
+                <w:sz w:val="20"/>
+                <w:szCs w:val="20"/>
+              </w:rPr>
+            </w:pPr>
+            <w:r>
+              <w:rPr>
+                <w:rFonts w:ascii="Calibri" w:hAnsi="Calibri" w:cs="Calibri"/>
+                <w:sz w:val="20"/>
+                <w:szCs w:val="20"/>
+              </w:rPr>
+              <w:drawing>
+                <wp:inline distT="0" distB="0" distL="0" distR="0" wp14:anchorId="4F27EB0B" wp14:editId="4970E01C">
+                  <wp:extent cx="1527175" cy="819150"/>
+                  <wp:effectExtent l="0" t="0" r="0" b="0"/>
+                  <wp:docPr id="2054708482" name="Picture 1"/>
+                  <wp:cNvGraphicFramePr>
+                    <a:graphicFrameLocks xmlns:a="http://schemas.openxmlformats.org/drawingml/2006/main" noChangeAspect="1"/>
+                  </wp:cNvGraphicFramePr>
+                  <a:graphic xmlns:a="http://schemas.openxmlformats.org/drawingml/2006/main">
+                    <a:graphicData uri="http://schemas.openxmlformats.org/drawingml/2006/picture">
+                      <pic:pic xmlns:pic="http://schemas.openxmlformats.org/drawingml/2006/picture">
+                        <pic:nvPicPr>
+                          <pic:cNvPr id="2054708482" name=""/>
+                          <pic:cNvPicPr/>
+                        </pic:nvPicPr>
+                        <pic:blipFill>
+                          <a:blip r:embed="rId5"/>
+                          <a:stretch>
+                            <a:fillRect/>
+                          </a:stretch>
+                        </pic:blipFill>
+                        <pic:spPr>
+                          <a:xfrm>
+                            <a:off x="0" y="0"/>
+                            <a:ext cx="1527175" cy="819150"/>
+                          </a:xfrm>
+                          <a:prstGeom prst="rect">
+                            <a:avLst/>
+                          </a:prstGeom>
+                        </pic:spPr>
+                      </pic:pic>
+                    </a:graphicData>
+                  </a:graphic>
+                </wp:inline>
+              </w:drawing>
+            </w:r>
+          </w:p>
+        </w:tc>
+        <w:tc>
+          <w:tcPr>
+            <w:tcW w:w="2622" w:type="dxa"/>
+          </w:tcPr>
+          <w:p>
+            <w:pPr>
+              <w:rPr>
+                <w:rFonts w:ascii="Calibri" w:hAnsi="Calibri" w:cs="Calibri"/>
+                <w:sz w:val="20"/>
+                <w:szCs w:val="20"/>
+              </w:rPr>
+            </w:pPr>
+            <w:r>
+              <w:rPr>
+                <w:rFonts w:ascii="Calibri" w:hAnsi="Calibri" w:cs="Calibri"/>
+                <w:sz w:val="20"/>
+                <w:szCs w:val="20"/>
+              </w:rPr>
+              <w:t>Sound effect used for the coin pick up. Made by pinging a glass.</w:t>
+            </w:r>
+          </w:p>
+        </w:tc>
+      </w:tr>
+      <w:tr>
+        <w:tc>
+          <w:tcPr>
+            <w:tcW w:w="2621" w:type="dxa"/>
+          </w:tcPr>
+          <w:p>
+            <w:pPr>
+              <w:rPr>
+                <w:rFonts w:ascii="Calibri" w:hAnsi="Calibri" w:cs="Calibri"/>
+                <w:sz w:val="20"/>
+                <w:szCs w:val="20"/>
+              </w:rPr>
+            </w:pPr>
+          </w:p>
+        </w:tc>
+        <w:tc>
+          <w:tcPr>
+            <w:tcW w:w="2621" w:type="dxa"/>
+          </w:tcPr>
+          <w:p>
+            <w:pPr>
+              <w:rPr>
+                <w:rFonts w:ascii="Calibri" w:hAnsi="Calibri" w:cs="Calibri"/>
+                <w:sz w:val="20"/>
+                <w:szCs w:val="20"/>
+              </w:rPr>
+            </w:pPr>
+          </w:p>
+        </w:tc>
+        <w:tc>
+          <w:tcPr>
+            <w:tcW w:w="2621" w:type="dxa"/>
+          </w:tcPr>
+          <w:p>
+            <w:pPr>
+              <w:rPr>
+                <w:rFonts w:ascii="Calibri" w:hAnsi="Calibri" w:cs="Calibri"/>
+                <w:sz w:val="20"/>
+                <w:szCs w:val="20"/>
+              </w:rPr>
+            </w:pPr>
+          </w:p>
+        </w:tc>
+        <w:tc>
+          <w:tcPr>
+            <w:tcW w:w="2622" w:type="dxa"/>
+          </w:tcPr>
+          <w:p>
+            <w:pPr>
+              <w:rPr>
+                <w:rFonts w:ascii="Calibri" w:hAnsi="Calibri" w:cs="Calibri"/>
+                <w:sz w:val="20"/>
+                <w:szCs w:val="20"/>
+              </w:rPr>
+            </w:pPr>
+          </w:p>
+        </w:tc>
+      </w:tr>
+      <w:tr>
+        <w:tc>
+          <w:tcPr>
+            <w:tcW w:w="2621" w:type="dxa"/>
+          </w:tcPr>
+          <w:p>
+            <w:pPr>
+              <w:rPr>
+                <w:rFonts w:ascii="Calibri" w:hAnsi="Calibri" w:cs="Calibri"/>
+                <w:sz w:val="20"/>
+                <w:szCs w:val="20"/>
+              </w:rPr>
+            </w:pPr>
+          </w:p>
+        </w:tc>
+        <w:tc>
+          <w:tcPr>
+            <w:tcW w:w="2621" w:type="dxa"/>
+          </w:tcPr>
+          <w:p>
+            <w:pPr>
+              <w:rPr>
+                <w:rFonts w:ascii="Calibri" w:hAnsi="Calibri" w:cs="Calibri"/>
+                <w:sz w:val="20"/>
+                <w:szCs w:val="20"/>
+              </w:rPr>
+            </w:pPr>
+          </w:p>
+        </w:tc>
+        <w:tc>
+          <w:tcPr>
+            <w:tcW w:w="2621" w:type="dxa"/>
+          </w:tcPr>
+          <w:p>
+            <w:pPr>
+              <w:rPr>
+                <w:rFonts w:ascii="Calibri" w:hAnsi="Calibri" w:cs="Calibri"/>
+                <w:sz w:val="20"/>
+                <w:szCs w:val="20"/>
+              </w:rPr>
+            </w:pPr>
+          </w:p>
+        </w:tc>
+        <w:tc>
+          <w:tcPr>
+            <w:tcW w:w="2622" w:type="dxa"/>
+          </w:tcPr>
+          <w:p>
+            <w:pPr>
+              <w:rPr>
+                <w:rFonts w:ascii="Calibri" w:hAnsi="Calibri" w:cs="Calibri"/>
+                <w:sz w:val="20"/>
+                <w:szCs w:val="20"/>
+              </w:rPr>
+            </w:pPr>
+          </w:p>
+        </w:tc>
+      </w:tr>
+      <w:tr>
+        <w:tc>
+          <w:tcPr>
+            <w:tcW w:w="2621" w:type="dxa"/>
+          </w:tcPr>
+          <w:p>
+            <w:pPr>
+              <w:rPr>
+                <w:rFonts w:ascii="Calibri" w:hAnsi="Calibri" w:cs="Calibri"/>
+                <w:sz w:val="20"/>
+                <w:szCs w:val="20"/>
+              </w:rPr>
+            </w:pPr>
+          </w:p>
+        </w:tc>
+        <w:tc>
+          <w:tcPr>
+            <w:tcW w:w="2621" w:type="dxa"/>
+          </w:tcPr>
+          <w:p>
+            <w:pPr>
+              <w:rPr>
+                <w:rFonts w:ascii="Calibri" w:hAnsi="Calibri" w:cs="Calibri"/>
+                <w:sz w:val="20"/>
+                <w:szCs w:val="20"/>
+              </w:rPr>
+            </w:pPr>
+          </w:p>
+        </w:tc>
+        <w:tc>
+          <w:tcPr>
+            <w:tcW w:w="2621" w:type="dxa"/>
+          </w:tcPr>
+          <w:p>
+            <w:pPr>
+              <w:rPr>
+                <w:rFonts w:ascii="Calibri" w:hAnsi="Calibri" w:cs="Calibri"/>
+                <w:sz w:val="20"/>
+                <w:szCs w:val="20"/>
+              </w:rPr>
+            </w:pPr>
+          </w:p>
+        </w:tc>
+        <w:tc>
+          <w:tcPr>
+            <w:tcW w:w="2622" w:type="dxa"/>
+          </w:tcPr>
+          <w:p>
+            <w:pPr>
+              <w:rPr>
+                <w:rFonts w:ascii="Calibri" w:hAnsi="Calibri" w:cs="Calibri"/>
+                <w:sz w:val="20"/>
+                <w:szCs w:val="20"/>
+              </w:rPr>
+            </w:pPr>
+          </w:p>
+        </w:tc>
+      </w:tr>
+    </w:tbl>
+    <w:p>
+      <w:pPr>
+        <w:rPr>
+          <w:rFonts w:ascii="Calibri" w:hAnsi="Calibri" w:cs="Calibri"/>
+        </w:rPr>
+      </w:pPr>
+    </w:p>
     <w:p>
       <w:pPr>
         <w:rPr>
@@ -831,16 +1463,6 @@
           <w:szCs w:val="40"/>
         </w:rPr>
       </w:pPr>
-      <w:r>
-        <w:rPr>
-          <w:rFonts w:ascii="Calibri" w:hAnsi="Calibri" w:cs="Calibri"/>
-          <w:b/>
-          <w:bCs/>
-          <w:sz w:val="40"/>
-          <w:szCs w:val="40"/>
-        </w:rPr>
-        <w:br w:type="page"/>
-      </w:r>
     </w:p>
     <w:tbl>
       <w:tblPr>
@@ -1529,7 +2151,7 @@
                           <pic:cNvPicPr/>
                         </pic:nvPicPr>
                         <pic:blipFill>
-                          <a:blip r:embed="rId4"/>
+                          <a:blip r:embed="rId6"/>
                           <a:stretch>
                             <a:fillRect/>
                           </a:stretch>
@@ -1782,7 +2404,7 @@
                           <pic:cNvPicPr/>
                         </pic:nvPicPr>
                         <pic:blipFill>
-                          <a:blip r:embed="rId5"/>
+                          <a:blip r:embed="rId7"/>
                           <a:stretch>
                             <a:fillRect/>
                           </a:stretch>
@@ -1865,7 +2487,7 @@
                           <pic:cNvPicPr/>
                         </pic:nvPicPr>
                         <pic:blipFill>
-                          <a:blip r:embed="rId6"/>
+                          <a:blip r:embed="rId8"/>
                           <a:stretch>
                             <a:fillRect/>
                           </a:stretch>
@@ -2269,7 +2891,7 @@
                           <pic:cNvPicPr/>
                         </pic:nvPicPr>
                         <pic:blipFill>
-                          <a:blip r:embed="rId7"/>
+                          <a:blip r:embed="rId9"/>
                           <a:stretch>
                             <a:fillRect/>
                           </a:stretch>
@@ -2374,7 +2996,7 @@
                           <pic:cNvPicPr/>
                         </pic:nvPicPr>
                         <pic:blipFill>
-                          <a:blip r:embed="rId8"/>
+                          <a:blip r:embed="rId10"/>
                           <a:stretch>
                             <a:fillRect/>
                           </a:stretch>

</xml_diff>

<commit_message>
Added Slime Sound Effect
</commit_message>
<xml_diff>
--- a/Assessment/Track Sheet.docx
+++ b/Assessment/Track Sheet.docx
@@ -300,6 +300,7 @@
               </w:rPr>
               <w:t xml:space="preserve">Duplicated pen click.mp3 to make 3 sound files </w:t>
             </w:r>
+            <w:proofErr w:type="spellStart"/>
             <w:r>
               <w:rPr>
                 <w:rFonts w:ascii="Calibri" w:hAnsi="Calibri" w:cs="Calibri"/>
@@ -308,6 +309,7 @@
               </w:rPr>
               <w:t>ButtonDown</w:t>
             </w:r>
+            <w:proofErr w:type="spellEnd"/>
             <w:r>
               <w:rPr>
                 <w:rFonts w:ascii="Calibri" w:hAnsi="Calibri" w:cs="Calibri"/>
@@ -316,6 +318,7 @@
               </w:rPr>
               <w:t xml:space="preserve">, </w:t>
             </w:r>
+            <w:proofErr w:type="spellStart"/>
             <w:r>
               <w:rPr>
                 <w:rFonts w:ascii="Calibri" w:hAnsi="Calibri" w:cs="Calibri"/>
@@ -324,6 +327,7 @@
               </w:rPr>
               <w:t>ButtonUp</w:t>
             </w:r>
+            <w:proofErr w:type="spellEnd"/>
             <w:r>
               <w:rPr>
                 <w:rFonts w:ascii="Calibri" w:hAnsi="Calibri" w:cs="Calibri"/>
@@ -876,6 +880,13 @@
                 <w:color w:val="000000" w:themeColor="text1"/>
               </w:rPr>
             </w:pPr>
+            <w:r>
+              <w:rPr>
+                <w:rFonts w:ascii="Calibri" w:hAnsi="Calibri" w:cs="Calibri"/>
+                <w:color w:val="000000" w:themeColor="text1"/>
+              </w:rPr>
+              <w:t>The sound effects used to create the players footsteps on 3 distinct materials (grass, path and rock)</w:t>
+            </w:r>
           </w:p>
         </w:tc>
       </w:tr>
@@ -1057,7 +1068,7 @@
                           <pic:cNvPicPr/>
                         </pic:nvPicPr>
                         <pic:blipFill>
-                          <a:blip r:embed="rId4"/>
+                          <a:blip r:embed="rId6"/>
                           <a:stretch>
                             <a:fillRect/>
                           </a:stretch>
@@ -1152,7 +1163,7 @@
                           <pic:cNvPicPr/>
                         </pic:nvPicPr>
                         <pic:blipFill rotWithShape="1">
-                          <a:blip r:embed="rId5"/>
+                          <a:blip r:embed="rId7"/>
                           <a:srcRect t="53112"/>
                           <a:stretch>
                             <a:fillRect/>
@@ -1272,6 +1283,32 @@
               <w:t>Trimmed clipped to just 2 beats.</w:t>
             </w:r>
           </w:p>
+          <w:p>
+            <w:pPr>
+              <w:rPr>
+                <w:rFonts w:ascii="Calibri" w:hAnsi="Calibri" w:cs="Calibri"/>
+                <w:sz w:val="20"/>
+                <w:szCs w:val="20"/>
+              </w:rPr>
+            </w:pPr>
+          </w:p>
+          <w:p>
+            <w:pPr>
+              <w:rPr>
+                <w:rFonts w:ascii="Calibri" w:hAnsi="Calibri" w:cs="Calibri"/>
+                <w:sz w:val="20"/>
+                <w:szCs w:val="20"/>
+              </w:rPr>
+            </w:pPr>
+            <w:r>
+              <w:rPr>
+                <w:rFonts w:ascii="Calibri" w:hAnsi="Calibri" w:cs="Calibri"/>
+                <w:sz w:val="20"/>
+                <w:szCs w:val="20"/>
+              </w:rPr>
+              <w:t>Lowered pitch by 9dB specifically for ConcreteWalk.m4a</w:t>
+            </w:r>
+          </w:p>
         </w:tc>
         <w:tc>
           <w:tcPr>
@@ -1333,7 +1370,7 @@
                           <pic:cNvPicPr/>
                         </pic:nvPicPr>
                         <pic:blipFill>
-                          <a:blip r:embed="rId6"/>
+                          <a:blip r:embed="rId8"/>
                           <a:stretch>
                             <a:fillRect/>
                           </a:stretch>
@@ -1482,7 +1519,25 @@
                 <w:sz w:val="20"/>
                 <w:szCs w:val="20"/>
               </w:rPr>
-              <w:t>Trimmed down to one foot step.</w:t>
+              <w:t xml:space="preserve">Trimmed down to one </w:t>
+            </w:r>
+            <w:proofErr w:type="gramStart"/>
+            <w:r>
+              <w:rPr>
+                <w:rFonts w:ascii="Calibri" w:hAnsi="Calibri" w:cs="Calibri"/>
+                <w:sz w:val="20"/>
+                <w:szCs w:val="20"/>
+              </w:rPr>
+              <w:t>foot step</w:t>
+            </w:r>
+            <w:proofErr w:type="gramEnd"/>
+            <w:r>
+              <w:rPr>
+                <w:rFonts w:ascii="Calibri" w:hAnsi="Calibri" w:cs="Calibri"/>
+                <w:sz w:val="20"/>
+                <w:szCs w:val="20"/>
+              </w:rPr>
+              <w:t>.</w:t>
             </w:r>
           </w:p>
           <w:p>
@@ -1571,6 +1626,7 @@
             <w:r>
               <w:rPr>
                 <w:rFonts w:ascii="Calibri" w:hAnsi="Calibri" w:cs="Calibri"/>
+                <w:noProof/>
                 <w:sz w:val="20"/>
                 <w:szCs w:val="20"/>
               </w:rPr>
@@ -1590,7 +1646,7 @@
                           <pic:cNvPicPr/>
                         </pic:nvPicPr>
                         <pic:blipFill>
-                          <a:blip r:embed="rId7"/>
+                          <a:blip r:embed="rId9"/>
                           <a:stretch>
                             <a:fillRect/>
                           </a:stretch>
@@ -1665,6 +1721,7 @@
             <w:r>
               <w:rPr>
                 <w:rFonts w:ascii="Calibri" w:hAnsi="Calibri" w:cs="Calibri"/>
+                <w:noProof/>
                 <w:sz w:val="20"/>
                 <w:szCs w:val="20"/>
               </w:rPr>
@@ -1684,7 +1741,7 @@
                           <pic:cNvPicPr/>
                         </pic:nvPicPr>
                         <pic:blipFill>
-                          <a:blip r:embed="rId8"/>
+                          <a:blip r:embed="rId10"/>
                           <a:stretch>
                             <a:fillRect/>
                           </a:stretch>
@@ -1724,23 +1781,7 @@
                 <w:sz w:val="20"/>
                 <w:szCs w:val="20"/>
               </w:rPr>
-              <w:t xml:space="preserve">Sound of a person walking over grass. </w:t>
-            </w:r>
-            <w:r>
-              <w:rPr>
-                <w:rFonts w:ascii="Calibri" w:hAnsi="Calibri" w:cs="Calibri"/>
-                <w:sz w:val="20"/>
-                <w:szCs w:val="20"/>
-              </w:rPr>
-              <w:t xml:space="preserve">Used for the footsteps of the player walking on the </w:t>
-            </w:r>
-            <w:r>
-              <w:rPr>
-                <w:rFonts w:ascii="Calibri" w:hAnsi="Calibri" w:cs="Calibri"/>
-                <w:sz w:val="20"/>
-                <w:szCs w:val="20"/>
-              </w:rPr>
-              <w:t>grass / shrub</w:t>
+              <w:t>Sound of a person walking over grass. Used for the footsteps of the player walking on the grass / shrub</w:t>
             </w:r>
             <w:r>
               <w:rPr>
@@ -1774,26 +1815,172 @@
                 <w:szCs w:val="20"/>
               </w:rPr>
             </w:pPr>
-          </w:p>
-        </w:tc>
-        <w:tc>
-          <w:tcPr>
-            <w:tcW w:w="2621" w:type="dxa"/>
-          </w:tcPr>
-          <w:p>
-            <w:pPr>
-              <w:rPr>
-                <w:rFonts w:ascii="Calibri" w:hAnsi="Calibri" w:cs="Calibri"/>
-                <w:sz w:val="20"/>
-                <w:szCs w:val="20"/>
-              </w:rPr>
-            </w:pPr>
-          </w:p>
-        </w:tc>
-        <w:tc>
-          <w:tcPr>
-            <w:tcW w:w="2621" w:type="dxa"/>
-          </w:tcPr>
+            <w:r>
+              <w:rPr>
+                <w:rFonts w:ascii="Calibri" w:hAnsi="Calibri" w:cs="Calibri"/>
+                <w:sz w:val="20"/>
+                <w:szCs w:val="20"/>
+              </w:rPr>
+              <w:t>ConcreteWalk.m4a</w:t>
+            </w:r>
+          </w:p>
+        </w:tc>
+        <w:tc>
+          <w:tcPr>
+            <w:tcW w:w="2621" w:type="dxa"/>
+          </w:tcPr>
+          <w:p>
+            <w:pPr>
+              <w:rPr>
+                <w:rFonts w:ascii="Calibri" w:hAnsi="Calibri" w:cs="Calibri"/>
+                <w:sz w:val="20"/>
+                <w:szCs w:val="20"/>
+              </w:rPr>
+            </w:pPr>
+            <w:r>
+              <w:rPr>
+                <w:rFonts w:ascii="Calibri" w:hAnsi="Calibri" w:cs="Calibri"/>
+                <w:sz w:val="20"/>
+                <w:szCs w:val="20"/>
+              </w:rPr>
+              <w:t>Trimmed clip down to only one footstep.</w:t>
+            </w:r>
+          </w:p>
+          <w:p>
+            <w:pPr>
+              <w:rPr>
+                <w:rFonts w:ascii="Calibri" w:hAnsi="Calibri" w:cs="Calibri"/>
+                <w:sz w:val="20"/>
+                <w:szCs w:val="20"/>
+              </w:rPr>
+            </w:pPr>
+          </w:p>
+          <w:p>
+            <w:pPr>
+              <w:rPr>
+                <w:rFonts w:ascii="Calibri" w:hAnsi="Calibri" w:cs="Calibri"/>
+                <w:sz w:val="20"/>
+                <w:szCs w:val="20"/>
+              </w:rPr>
+            </w:pPr>
+          </w:p>
+        </w:tc>
+        <w:tc>
+          <w:tcPr>
+            <w:tcW w:w="2621" w:type="dxa"/>
+          </w:tcPr>
+          <w:p>
+            <w:pPr>
+              <w:rPr>
+                <w:rFonts w:ascii="Calibri" w:hAnsi="Calibri" w:cs="Calibri"/>
+                <w:sz w:val="20"/>
+                <w:szCs w:val="20"/>
+              </w:rPr>
+            </w:pPr>
+            <w:r>
+              <w:rPr>
+                <w:rFonts w:ascii="Calibri" w:hAnsi="Calibri" w:cs="Calibri"/>
+                <w:sz w:val="20"/>
+                <w:szCs w:val="20"/>
+              </w:rPr>
+              <w:t>Amplified audio clip by 13dB.</w:t>
+            </w:r>
+          </w:p>
+          <w:p>
+            <w:pPr>
+              <w:rPr>
+                <w:rFonts w:ascii="Calibri" w:hAnsi="Calibri" w:cs="Calibri"/>
+                <w:sz w:val="20"/>
+                <w:szCs w:val="20"/>
+              </w:rPr>
+            </w:pPr>
+          </w:p>
+          <w:p>
+            <w:pPr>
+              <w:rPr>
+                <w:rFonts w:ascii="Calibri" w:hAnsi="Calibri" w:cs="Calibri"/>
+                <w:sz w:val="20"/>
+                <w:szCs w:val="20"/>
+              </w:rPr>
+            </w:pPr>
+            <w:r>
+              <w:rPr>
+                <w:rFonts w:ascii="Calibri" w:hAnsi="Calibri" w:cs="Calibri"/>
+                <w:sz w:val="20"/>
+                <w:szCs w:val="20"/>
+              </w:rPr>
+              <w:t>Used a low pass filter with cutoff at 900 Hz with a 6 dB roll off to birds tweeting and grass noises.</w:t>
+            </w:r>
+          </w:p>
+          <w:p>
+            <w:pPr>
+              <w:rPr>
+                <w:rFonts w:ascii="Calibri" w:hAnsi="Calibri" w:cs="Calibri"/>
+                <w:sz w:val="20"/>
+                <w:szCs w:val="20"/>
+              </w:rPr>
+            </w:pPr>
+          </w:p>
+          <w:p>
+            <w:pPr>
+              <w:rPr>
+                <w:rFonts w:ascii="Calibri" w:hAnsi="Calibri" w:cs="Calibri"/>
+                <w:sz w:val="20"/>
+                <w:szCs w:val="20"/>
+              </w:rPr>
+            </w:pPr>
+            <w:r>
+              <w:rPr>
+                <w:rFonts w:ascii="Calibri" w:hAnsi="Calibri" w:cs="Calibri"/>
+                <w:sz w:val="20"/>
+                <w:szCs w:val="20"/>
+              </w:rPr>
+              <w:t xml:space="preserve">Use noise reduction to remove any remaining bird tweets </w:t>
+            </w:r>
+            <w:r>
+              <w:rPr>
+                <w:rFonts w:ascii="Calibri" w:hAnsi="Calibri" w:cs="Calibri"/>
+                <w:noProof/>
+                <w:sz w:val="20"/>
+                <w:szCs w:val="20"/>
+              </w:rPr>
+              <w:drawing>
+                <wp:inline distT="0" distB="0" distL="0" distR="0" wp14:anchorId="12E666B3" wp14:editId="2BFEADC1">
+                  <wp:extent cx="1527175" cy="452755"/>
+                  <wp:effectExtent l="0" t="0" r="0" b="4445"/>
+                  <wp:docPr id="1218659631" name="Picture 1"/>
+                  <wp:cNvGraphicFramePr>
+                    <a:graphicFrameLocks xmlns:a="http://schemas.openxmlformats.org/drawingml/2006/main" noChangeAspect="1"/>
+                  </wp:cNvGraphicFramePr>
+                  <a:graphic xmlns:a="http://schemas.openxmlformats.org/drawingml/2006/main">
+                    <a:graphicData uri="http://schemas.openxmlformats.org/drawingml/2006/picture">
+                      <pic:pic xmlns:pic="http://schemas.openxmlformats.org/drawingml/2006/picture">
+                        <pic:nvPicPr>
+                          <pic:cNvPr id="1218659631" name=""/>
+                          <pic:cNvPicPr/>
+                        </pic:nvPicPr>
+                        <pic:blipFill>
+                          <a:blip r:embed="rId11"/>
+                          <a:stretch>
+                            <a:fillRect/>
+                          </a:stretch>
+                        </pic:blipFill>
+                        <pic:spPr>
+                          <a:xfrm>
+                            <a:off x="0" y="0"/>
+                            <a:ext cx="1527175" cy="452755"/>
+                          </a:xfrm>
+                          <a:prstGeom prst="rect">
+                            <a:avLst/>
+                          </a:prstGeom>
+                        </pic:spPr>
+                      </pic:pic>
+                    </a:graphicData>
+                  </a:graphic>
+                </wp:inline>
+              </w:drawing>
+            </w:r>
+          </w:p>
           <w:p>
             <w:pPr>
               <w:rPr>
@@ -1816,6 +2003,14 @@
                 <w:szCs w:val="20"/>
               </w:rPr>
             </w:pPr>
+            <w:r>
+              <w:rPr>
+                <w:rFonts w:ascii="Calibri" w:hAnsi="Calibri" w:cs="Calibri"/>
+                <w:sz w:val="20"/>
+                <w:szCs w:val="20"/>
+              </w:rPr>
+              <w:t>Sound of a person walking on concrete garden slabs.</w:t>
+            </w:r>
           </w:p>
         </w:tc>
       </w:tr>
@@ -1938,6 +2133,7 @@
                 <w:sz w:val="32"/>
                 <w:szCs w:val="32"/>
               </w:rPr>
+              <w:lastRenderedPageBreak/>
               <w:t>Pick up SFXs</w:t>
             </w:r>
           </w:p>
@@ -2085,7 +2281,6 @@
                 <w:sz w:val="20"/>
                 <w:szCs w:val="20"/>
               </w:rPr>
-              <w:lastRenderedPageBreak/>
               <w:t>Coin Pick Up.mp3</w:t>
             </w:r>
           </w:p>
@@ -2198,7 +2393,7 @@
                           <pic:cNvPicPr/>
                         </pic:nvPicPr>
                         <pic:blipFill>
-                          <a:blip r:embed="rId9"/>
+                          <a:blip r:embed="rId12"/>
                           <a:stretch>
                             <a:fillRect/>
                           </a:stretch>
@@ -2319,7 +2514,7 @@
                           <pic:cNvPicPr/>
                         </pic:nvPicPr>
                         <pic:blipFill>
-                          <a:blip r:embed="rId10"/>
+                          <a:blip r:embed="rId13"/>
                           <a:stretch>
                             <a:fillRect/>
                           </a:stretch>
@@ -2462,7 +2657,7 @@
                           <pic:cNvPicPr/>
                         </pic:nvPicPr>
                         <pic:blipFill>
-                          <a:blip r:embed="rId11"/>
+                          <a:blip r:embed="rId14"/>
                           <a:stretch>
                             <a:fillRect/>
                           </a:stretch>
@@ -2618,7 +2813,7 @@
                           <pic:cNvPicPr/>
                         </pic:nvPicPr>
                         <pic:blipFill>
-                          <a:blip r:embed="rId12"/>
+                          <a:blip r:embed="rId15"/>
                           <a:stretch>
                             <a:fillRect/>
                           </a:stretch>
@@ -2668,6 +2863,39 @@
       <w:pPr>
         <w:rPr>
           <w:rFonts w:ascii="Calibri" w:hAnsi="Calibri" w:cs="Calibri"/>
+        </w:rPr>
+      </w:pPr>
+    </w:p>
+    <w:p>
+      <w:pPr>
+        <w:rPr>
+          <w:rFonts w:ascii="Calibri" w:hAnsi="Calibri" w:cs="Calibri"/>
+          <w:b/>
+          <w:bCs/>
+          <w:sz w:val="40"/>
+          <w:szCs w:val="40"/>
+        </w:rPr>
+      </w:pPr>
+    </w:p>
+    <w:p>
+      <w:pPr>
+        <w:rPr>
+          <w:rFonts w:ascii="Calibri" w:hAnsi="Calibri" w:cs="Calibri"/>
+          <w:b/>
+          <w:bCs/>
+          <w:sz w:val="40"/>
+          <w:szCs w:val="40"/>
+        </w:rPr>
+      </w:pPr>
+    </w:p>
+    <w:p>
+      <w:pPr>
+        <w:rPr>
+          <w:rFonts w:ascii="Calibri" w:hAnsi="Calibri" w:cs="Calibri"/>
+          <w:b/>
+          <w:bCs/>
+          <w:sz w:val="40"/>
+          <w:szCs w:val="40"/>
         </w:rPr>
       </w:pPr>
     </w:p>
@@ -2698,6 +2926,986 @@
       <w:tr>
         <w:tc>
           <w:tcPr>
+            <w:tcW w:w="10485" w:type="dxa"/>
+            <w:gridSpan w:val="4"/>
+            <w:shd w:val="clear" w:color="auto" w:fill="DAE9F7" w:themeFill="text2" w:themeFillTint="1A"/>
+          </w:tcPr>
+          <w:p>
+            <w:pPr>
+              <w:jc w:val="center"/>
+              <w:rPr>
+                <w:rFonts w:ascii="Calibri" w:hAnsi="Calibri" w:cs="Calibri"/>
+                <w:b/>
+                <w:bCs/>
+                <w:color w:val="215E99" w:themeColor="text2" w:themeTint="BF"/>
+                <w:sz w:val="32"/>
+                <w:szCs w:val="32"/>
+              </w:rPr>
+            </w:pPr>
+            <w:r>
+              <w:rPr>
+                <w:rFonts w:ascii="Calibri" w:hAnsi="Calibri" w:cs="Calibri"/>
+                <w:b/>
+                <w:bCs/>
+                <w:color w:val="215E99" w:themeColor="text2" w:themeTint="BF"/>
+                <w:sz w:val="32"/>
+                <w:szCs w:val="32"/>
+              </w:rPr>
+              <w:t>HUD SFXs</w:t>
+            </w:r>
+          </w:p>
+        </w:tc>
+      </w:tr>
+      <w:tr>
+        <w:tc>
+          <w:tcPr>
+            <w:tcW w:w="10485" w:type="dxa"/>
+            <w:gridSpan w:val="4"/>
+          </w:tcPr>
+          <w:p>
+            <w:pPr>
+              <w:rPr>
+                <w:rFonts w:ascii="Calibri" w:hAnsi="Calibri" w:cs="Calibri"/>
+                <w:color w:val="000000" w:themeColor="text1"/>
+              </w:rPr>
+            </w:pPr>
+          </w:p>
+        </w:tc>
+      </w:tr>
+      <w:tr>
+        <w:tc>
+          <w:tcPr>
+            <w:tcW w:w="2621" w:type="dxa"/>
+            <w:shd w:val="clear" w:color="auto" w:fill="DAE9F7" w:themeFill="text2" w:themeFillTint="1A"/>
+          </w:tcPr>
+          <w:p>
+            <w:pPr>
+              <w:rPr>
+                <w:rFonts w:ascii="Calibri" w:hAnsi="Calibri" w:cs="Calibri"/>
+                <w:color w:val="215E99" w:themeColor="text2" w:themeTint="BF"/>
+              </w:rPr>
+            </w:pPr>
+            <w:r>
+              <w:rPr>
+                <w:rFonts w:ascii="Calibri" w:hAnsi="Calibri" w:cs="Calibri"/>
+                <w:color w:val="215E99" w:themeColor="text2" w:themeTint="BF"/>
+              </w:rPr>
+              <w:t>Source files</w:t>
+            </w:r>
+          </w:p>
+        </w:tc>
+        <w:tc>
+          <w:tcPr>
+            <w:tcW w:w="2621" w:type="dxa"/>
+            <w:shd w:val="clear" w:color="auto" w:fill="DAE9F7" w:themeFill="text2" w:themeFillTint="1A"/>
+          </w:tcPr>
+          <w:p>
+            <w:pPr>
+              <w:rPr>
+                <w:rFonts w:ascii="Calibri" w:hAnsi="Calibri" w:cs="Calibri"/>
+                <w:color w:val="215E99" w:themeColor="text2" w:themeTint="BF"/>
+              </w:rPr>
+            </w:pPr>
+            <w:r>
+              <w:rPr>
+                <w:rFonts w:ascii="Calibri" w:hAnsi="Calibri" w:cs="Calibri"/>
+                <w:color w:val="215E99" w:themeColor="text2" w:themeTint="BF"/>
+              </w:rPr>
+              <w:t>Editing performed</w:t>
+            </w:r>
+          </w:p>
+        </w:tc>
+        <w:tc>
+          <w:tcPr>
+            <w:tcW w:w="2621" w:type="dxa"/>
+            <w:shd w:val="clear" w:color="auto" w:fill="DAE9F7" w:themeFill="text2" w:themeFillTint="1A"/>
+          </w:tcPr>
+          <w:p>
+            <w:pPr>
+              <w:rPr>
+                <w:rFonts w:ascii="Calibri" w:hAnsi="Calibri" w:cs="Calibri"/>
+                <w:color w:val="215E99" w:themeColor="text2" w:themeTint="BF"/>
+              </w:rPr>
+            </w:pPr>
+            <w:r>
+              <w:rPr>
+                <w:rFonts w:ascii="Calibri" w:hAnsi="Calibri" w:cs="Calibri"/>
+                <w:color w:val="215E99" w:themeColor="text2" w:themeTint="BF"/>
+              </w:rPr>
+              <w:t>Effects applied</w:t>
+            </w:r>
+          </w:p>
+        </w:tc>
+        <w:tc>
+          <w:tcPr>
+            <w:tcW w:w="2622" w:type="dxa"/>
+            <w:shd w:val="clear" w:color="auto" w:fill="DAE9F7" w:themeFill="text2" w:themeFillTint="1A"/>
+          </w:tcPr>
+          <w:p>
+            <w:pPr>
+              <w:rPr>
+                <w:rFonts w:ascii="Calibri" w:hAnsi="Calibri" w:cs="Calibri"/>
+                <w:color w:val="215E99" w:themeColor="text2" w:themeTint="BF"/>
+              </w:rPr>
+            </w:pPr>
+            <w:r>
+              <w:rPr>
+                <w:rFonts w:ascii="Calibri" w:hAnsi="Calibri" w:cs="Calibri"/>
+                <w:color w:val="215E99" w:themeColor="text2" w:themeTint="BF"/>
+              </w:rPr>
+              <w:t>Comments</w:t>
+            </w:r>
+          </w:p>
+        </w:tc>
+      </w:tr>
+      <w:tr>
+        <w:tc>
+          <w:tcPr>
+            <w:tcW w:w="2621" w:type="dxa"/>
+          </w:tcPr>
+          <w:p>
+            <w:pPr>
+              <w:rPr>
+                <w:rFonts w:ascii="Calibri" w:hAnsi="Calibri" w:cs="Calibri"/>
+                <w:sz w:val="20"/>
+                <w:szCs w:val="20"/>
+              </w:rPr>
+            </w:pPr>
+            <w:r>
+              <w:rPr>
+                <w:rFonts w:ascii="Calibri" w:hAnsi="Calibri" w:cs="Calibri"/>
+                <w:sz w:val="20"/>
+                <w:szCs w:val="20"/>
+              </w:rPr>
+              <w:t>Flannel.m4a</w:t>
+            </w:r>
+          </w:p>
+        </w:tc>
+        <w:tc>
+          <w:tcPr>
+            <w:tcW w:w="2621" w:type="dxa"/>
+          </w:tcPr>
+          <w:p>
+            <w:pPr>
+              <w:rPr>
+                <w:rFonts w:ascii="Calibri" w:hAnsi="Calibri" w:cs="Calibri"/>
+                <w:sz w:val="20"/>
+                <w:szCs w:val="20"/>
+              </w:rPr>
+            </w:pPr>
+            <w:r>
+              <w:rPr>
+                <w:rFonts w:ascii="Calibri" w:hAnsi="Calibri" w:cs="Calibri"/>
+                <w:sz w:val="20"/>
+                <w:szCs w:val="20"/>
+              </w:rPr>
+              <w:t>Trimmed down to around 20 seconds of sound.</w:t>
+            </w:r>
+          </w:p>
+        </w:tc>
+        <w:tc>
+          <w:tcPr>
+            <w:tcW w:w="2621" w:type="dxa"/>
+          </w:tcPr>
+          <w:p>
+            <w:pPr>
+              <w:rPr>
+                <w:rFonts w:ascii="Calibri" w:hAnsi="Calibri" w:cs="Calibri"/>
+                <w:sz w:val="20"/>
+                <w:szCs w:val="20"/>
+              </w:rPr>
+            </w:pPr>
+            <w:r>
+              <w:rPr>
+                <w:rFonts w:ascii="Calibri" w:hAnsi="Calibri" w:cs="Calibri"/>
+                <w:sz w:val="20"/>
+                <w:szCs w:val="20"/>
+              </w:rPr>
+              <w:t>Amplified by 7 dB</w:t>
+            </w:r>
+          </w:p>
+          <w:p>
+            <w:pPr>
+              <w:rPr>
+                <w:rFonts w:ascii="Calibri" w:hAnsi="Calibri" w:cs="Calibri"/>
+                <w:sz w:val="20"/>
+                <w:szCs w:val="20"/>
+              </w:rPr>
+            </w:pPr>
+          </w:p>
+          <w:p>
+            <w:pPr>
+              <w:rPr>
+                <w:rFonts w:ascii="Calibri" w:hAnsi="Calibri" w:cs="Calibri"/>
+                <w:sz w:val="20"/>
+                <w:szCs w:val="20"/>
+              </w:rPr>
+            </w:pPr>
+            <w:r>
+              <w:rPr>
+                <w:rFonts w:ascii="Calibri" w:hAnsi="Calibri" w:cs="Calibri"/>
+                <w:sz w:val="20"/>
+                <w:szCs w:val="20"/>
+              </w:rPr>
+              <w:t>Low pass filter at cutoff 7000 Hz by with a 24 dB roll off to remove high pitch squeaks.</w:t>
+            </w:r>
+          </w:p>
+          <w:p>
+            <w:pPr>
+              <w:rPr>
+                <w:rFonts w:ascii="Calibri" w:hAnsi="Calibri" w:cs="Calibri"/>
+                <w:sz w:val="20"/>
+                <w:szCs w:val="20"/>
+              </w:rPr>
+            </w:pPr>
+          </w:p>
+          <w:p>
+            <w:pPr>
+              <w:rPr>
+                <w:rFonts w:ascii="Calibri" w:hAnsi="Calibri" w:cs="Calibri"/>
+                <w:sz w:val="20"/>
+                <w:szCs w:val="20"/>
+              </w:rPr>
+            </w:pPr>
+            <w:r>
+              <w:rPr>
+                <w:rFonts w:ascii="Calibri" w:hAnsi="Calibri" w:cs="Calibri"/>
+                <w:sz w:val="20"/>
+                <w:szCs w:val="20"/>
+              </w:rPr>
+              <w:t xml:space="preserve">Adjusted tempo by -10% to give a thicker, </w:t>
+            </w:r>
+            <w:r>
+              <w:rPr>
+                <w:rFonts w:ascii="Calibri" w:hAnsi="Calibri" w:cs="Calibri"/>
+                <w:sz w:val="20"/>
+                <w:szCs w:val="20"/>
+              </w:rPr>
+              <w:t>slimier</w:t>
+            </w:r>
+            <w:r>
+              <w:rPr>
+                <w:rFonts w:ascii="Calibri" w:hAnsi="Calibri" w:cs="Calibri"/>
+                <w:sz w:val="20"/>
+                <w:szCs w:val="20"/>
+              </w:rPr>
+              <w:t xml:space="preserve"> feel.</w:t>
+            </w:r>
+          </w:p>
+          <w:p>
+            <w:pPr>
+              <w:rPr>
+                <w:rFonts w:ascii="Calibri" w:hAnsi="Calibri" w:cs="Calibri"/>
+                <w:sz w:val="20"/>
+                <w:szCs w:val="20"/>
+              </w:rPr>
+            </w:pPr>
+          </w:p>
+          <w:p>
+            <w:pPr>
+              <w:rPr>
+                <w:rFonts w:ascii="Calibri" w:hAnsi="Calibri" w:cs="Calibri"/>
+                <w:sz w:val="20"/>
+                <w:szCs w:val="20"/>
+              </w:rPr>
+            </w:pPr>
+            <w:r>
+              <w:rPr>
+                <w:rFonts w:ascii="Calibri" w:hAnsi="Calibri" w:cs="Calibri"/>
+                <w:sz w:val="20"/>
+                <w:szCs w:val="20"/>
+              </w:rPr>
+              <w:t xml:space="preserve">Added a small amount of reverb </w:t>
+            </w:r>
+            <w:r>
+              <w:rPr>
+                <w:rFonts w:ascii="Calibri" w:hAnsi="Calibri" w:cs="Calibri"/>
+                <w:sz w:val="20"/>
+                <w:szCs w:val="20"/>
+              </w:rPr>
+              <w:drawing>
+                <wp:inline distT="0" distB="0" distL="0" distR="0" wp14:anchorId="535552A5" wp14:editId="0B506700">
+                  <wp:extent cx="1527175" cy="1913890"/>
+                  <wp:effectExtent l="0" t="0" r="0" b="0"/>
+                  <wp:docPr id="1136222727" name="Picture 1"/>
+                  <wp:cNvGraphicFramePr>
+                    <a:graphicFrameLocks xmlns:a="http://schemas.openxmlformats.org/drawingml/2006/main" noChangeAspect="1"/>
+                  </wp:cNvGraphicFramePr>
+                  <a:graphic xmlns:a="http://schemas.openxmlformats.org/drawingml/2006/main">
+                    <a:graphicData uri="http://schemas.openxmlformats.org/drawingml/2006/picture">
+                      <pic:pic xmlns:pic="http://schemas.openxmlformats.org/drawingml/2006/picture">
+                        <pic:nvPicPr>
+                          <pic:cNvPr id="1136222727" name=""/>
+                          <pic:cNvPicPr/>
+                        </pic:nvPicPr>
+                        <pic:blipFill>
+                          <a:blip r:embed="rId16"/>
+                          <a:stretch>
+                            <a:fillRect/>
+                          </a:stretch>
+                        </pic:blipFill>
+                        <pic:spPr>
+                          <a:xfrm>
+                            <a:off x="0" y="0"/>
+                            <a:ext cx="1527175" cy="1913890"/>
+                          </a:xfrm>
+                          <a:prstGeom prst="rect">
+                            <a:avLst/>
+                          </a:prstGeom>
+                        </pic:spPr>
+                      </pic:pic>
+                    </a:graphicData>
+                  </a:graphic>
+                </wp:inline>
+              </w:drawing>
+            </w:r>
+          </w:p>
+        </w:tc>
+        <w:tc>
+          <w:tcPr>
+            <w:tcW w:w="2622" w:type="dxa"/>
+          </w:tcPr>
+          <w:p>
+            <w:pPr>
+              <w:rPr>
+                <w:rFonts w:ascii="Calibri" w:hAnsi="Calibri" w:cs="Calibri"/>
+                <w:sz w:val="20"/>
+                <w:szCs w:val="20"/>
+              </w:rPr>
+            </w:pPr>
+            <w:r>
+              <w:rPr>
+                <w:rFonts w:ascii="Calibri" w:hAnsi="Calibri" w:cs="Calibri"/>
+                <w:sz w:val="20"/>
+                <w:szCs w:val="20"/>
+              </w:rPr>
+              <w:t>The sound of  a</w:t>
+            </w:r>
+            <w:r>
+              <w:rPr>
+                <w:rFonts w:ascii="Calibri" w:hAnsi="Calibri" w:cs="Calibri"/>
+                <w:sz w:val="20"/>
+                <w:szCs w:val="20"/>
+              </w:rPr>
+              <w:t xml:space="preserve"> wet</w:t>
+            </w:r>
+            <w:r>
+              <w:rPr>
+                <w:rFonts w:ascii="Calibri" w:hAnsi="Calibri" w:cs="Calibri"/>
+                <w:sz w:val="20"/>
+                <w:szCs w:val="20"/>
+              </w:rPr>
+              <w:t xml:space="preserve"> flannel being squeezed</w:t>
+            </w:r>
+            <w:r>
+              <w:rPr>
+                <w:rFonts w:ascii="Calibri" w:hAnsi="Calibri" w:cs="Calibri"/>
+                <w:sz w:val="20"/>
+                <w:szCs w:val="20"/>
+              </w:rPr>
+              <w:t>.</w:t>
+            </w:r>
+          </w:p>
+        </w:tc>
+      </w:tr>
+      <w:tr>
+        <w:tc>
+          <w:tcPr>
+            <w:tcW w:w="2621" w:type="dxa"/>
+          </w:tcPr>
+          <w:p>
+            <w:pPr>
+              <w:rPr>
+                <w:rFonts w:ascii="Calibri" w:hAnsi="Calibri" w:cs="Calibri"/>
+                <w:sz w:val="20"/>
+                <w:szCs w:val="20"/>
+              </w:rPr>
+            </w:pPr>
+            <w:r>
+              <w:rPr>
+                <w:rFonts w:ascii="Calibri" w:hAnsi="Calibri" w:cs="Calibri"/>
+                <w:sz w:val="20"/>
+                <w:szCs w:val="20"/>
+              </w:rPr>
+              <w:t>Water.m4a</w:t>
+            </w:r>
+          </w:p>
+        </w:tc>
+        <w:tc>
+          <w:tcPr>
+            <w:tcW w:w="2621" w:type="dxa"/>
+          </w:tcPr>
+          <w:p>
+            <w:pPr>
+              <w:rPr>
+                <w:rFonts w:ascii="Calibri" w:hAnsi="Calibri" w:cs="Calibri"/>
+                <w:sz w:val="20"/>
+                <w:szCs w:val="20"/>
+              </w:rPr>
+            </w:pPr>
+            <w:r>
+              <w:rPr>
+                <w:rFonts w:ascii="Calibri" w:hAnsi="Calibri" w:cs="Calibri"/>
+                <w:sz w:val="20"/>
+                <w:szCs w:val="20"/>
+              </w:rPr>
+              <w:t>Trimmed down to around 20 seconds of sound.</w:t>
+            </w:r>
+          </w:p>
+          <w:p>
+            <w:pPr>
+              <w:rPr>
+                <w:rFonts w:ascii="Calibri" w:hAnsi="Calibri" w:cs="Calibri"/>
+                <w:sz w:val="20"/>
+                <w:szCs w:val="20"/>
+              </w:rPr>
+            </w:pPr>
+          </w:p>
+          <w:p>
+            <w:pPr>
+              <w:rPr>
+                <w:rFonts w:ascii="Calibri" w:hAnsi="Calibri" w:cs="Calibri"/>
+                <w:sz w:val="20"/>
+                <w:szCs w:val="20"/>
+              </w:rPr>
+            </w:pPr>
+            <w:r>
+              <w:rPr>
+                <w:rFonts w:ascii="Calibri" w:hAnsi="Calibri" w:cs="Calibri"/>
+                <w:sz w:val="20"/>
+                <w:szCs w:val="20"/>
+              </w:rPr>
+              <w:t>Moved in a way which the ripple peaks match on average slightly after the flannel peaks.</w:t>
+            </w:r>
+          </w:p>
+        </w:tc>
+        <w:tc>
+          <w:tcPr>
+            <w:tcW w:w="2621" w:type="dxa"/>
+          </w:tcPr>
+          <w:p>
+            <w:pPr>
+              <w:rPr>
+                <w:rFonts w:ascii="Calibri" w:hAnsi="Calibri" w:cs="Calibri"/>
+                <w:sz w:val="20"/>
+                <w:szCs w:val="20"/>
+              </w:rPr>
+            </w:pPr>
+            <w:r>
+              <w:rPr>
+                <w:rFonts w:ascii="Calibri" w:hAnsi="Calibri" w:cs="Calibri"/>
+                <w:sz w:val="20"/>
+                <w:szCs w:val="20"/>
+              </w:rPr>
+              <w:t xml:space="preserve">Applied Filter Curve EQ to make water sound “slimier” by removing low and high pitches. </w:t>
+            </w:r>
+            <w:r>
+              <w:rPr>
+                <w:rFonts w:ascii="Calibri" w:hAnsi="Calibri" w:cs="Calibri"/>
+                <w:sz w:val="20"/>
+                <w:szCs w:val="20"/>
+              </w:rPr>
+              <w:drawing>
+                <wp:inline distT="0" distB="0" distL="0" distR="0" wp14:anchorId="3EAAB72B" wp14:editId="3641CE54">
+                  <wp:extent cx="1527175" cy="819150"/>
+                  <wp:effectExtent l="0" t="0" r="0" b="0"/>
+                  <wp:docPr id="833951028" name="Picture 1"/>
+                  <wp:cNvGraphicFramePr>
+                    <a:graphicFrameLocks xmlns:a="http://schemas.openxmlformats.org/drawingml/2006/main" noChangeAspect="1"/>
+                  </wp:cNvGraphicFramePr>
+                  <a:graphic xmlns:a="http://schemas.openxmlformats.org/drawingml/2006/main">
+                    <a:graphicData uri="http://schemas.openxmlformats.org/drawingml/2006/picture">
+                      <pic:pic xmlns:pic="http://schemas.openxmlformats.org/drawingml/2006/picture">
+                        <pic:nvPicPr>
+                          <pic:cNvPr id="833951028" name=""/>
+                          <pic:cNvPicPr/>
+                        </pic:nvPicPr>
+                        <pic:blipFill>
+                          <a:blip r:embed="rId17"/>
+                          <a:stretch>
+                            <a:fillRect/>
+                          </a:stretch>
+                        </pic:blipFill>
+                        <pic:spPr>
+                          <a:xfrm>
+                            <a:off x="0" y="0"/>
+                            <a:ext cx="1527175" cy="819150"/>
+                          </a:xfrm>
+                          <a:prstGeom prst="rect">
+                            <a:avLst/>
+                          </a:prstGeom>
+                        </pic:spPr>
+                      </pic:pic>
+                    </a:graphicData>
+                  </a:graphic>
+                </wp:inline>
+              </w:drawing>
+            </w:r>
+          </w:p>
+          <w:p>
+            <w:pPr>
+              <w:rPr>
+                <w:rFonts w:ascii="Calibri" w:hAnsi="Calibri" w:cs="Calibri"/>
+                <w:sz w:val="20"/>
+                <w:szCs w:val="20"/>
+              </w:rPr>
+            </w:pPr>
+          </w:p>
+          <w:p>
+            <w:pPr>
+              <w:rPr>
+                <w:rFonts w:ascii="Calibri" w:hAnsi="Calibri" w:cs="Calibri"/>
+                <w:sz w:val="20"/>
+                <w:szCs w:val="20"/>
+              </w:rPr>
+            </w:pPr>
+            <w:r>
+              <w:rPr>
+                <w:rFonts w:ascii="Calibri" w:hAnsi="Calibri" w:cs="Calibri"/>
+                <w:sz w:val="20"/>
+                <w:szCs w:val="20"/>
+              </w:rPr>
+              <w:t>Amplified by 2dB to keep water quiet but hearable.</w:t>
+            </w:r>
+          </w:p>
+        </w:tc>
+        <w:tc>
+          <w:tcPr>
+            <w:tcW w:w="2622" w:type="dxa"/>
+          </w:tcPr>
+          <w:p>
+            <w:pPr>
+              <w:rPr>
+                <w:rFonts w:ascii="Calibri" w:hAnsi="Calibri" w:cs="Calibri"/>
+                <w:sz w:val="20"/>
+                <w:szCs w:val="20"/>
+              </w:rPr>
+            </w:pPr>
+            <w:r>
+              <w:rPr>
+                <w:rFonts w:ascii="Calibri" w:hAnsi="Calibri" w:cs="Calibri"/>
+                <w:sz w:val="20"/>
+                <w:szCs w:val="20"/>
+              </w:rPr>
+              <w:t>Sound of ripples across a water surface.</w:t>
+            </w:r>
+          </w:p>
+        </w:tc>
+      </w:tr>
+      <w:tr>
+        <w:tc>
+          <w:tcPr>
+            <w:tcW w:w="2621" w:type="dxa"/>
+          </w:tcPr>
+          <w:p>
+            <w:pPr>
+              <w:rPr>
+                <w:rFonts w:ascii="Calibri" w:hAnsi="Calibri" w:cs="Calibri"/>
+                <w:sz w:val="20"/>
+                <w:szCs w:val="20"/>
+              </w:rPr>
+            </w:pPr>
+            <w:r>
+              <w:rPr>
+                <w:rFonts w:ascii="Calibri" w:hAnsi="Calibri" w:cs="Calibri"/>
+                <w:sz w:val="20"/>
+                <w:szCs w:val="20"/>
+              </w:rPr>
+              <w:t>Laugh.ogg</w:t>
+            </w:r>
+          </w:p>
+          <w:p>
+            <w:pPr>
+              <w:rPr>
+                <w:rFonts w:ascii="Calibri" w:hAnsi="Calibri" w:cs="Calibri"/>
+                <w:sz w:val="20"/>
+                <w:szCs w:val="20"/>
+              </w:rPr>
+            </w:pPr>
+            <w:hyperlink r:id="rId18" w:history="1">
+              <w:r>
+                <w:rPr>
+                  <w:rStyle w:val="Hyperlink"/>
+                  <w:rFonts w:ascii="Calibri" w:hAnsi="Calibri" w:cs="Calibri"/>
+                  <w:sz w:val="20"/>
+                  <w:szCs w:val="20"/>
+                </w:rPr>
+                <w:t>https://opengameart.org/content/tiny-creatures-sounds</w:t>
+              </w:r>
+            </w:hyperlink>
+          </w:p>
+          <w:p>
+            <w:pPr>
+              <w:rPr>
+                <w:rFonts w:ascii="Calibri" w:hAnsi="Calibri" w:cs="Calibri"/>
+                <w:sz w:val="20"/>
+                <w:szCs w:val="20"/>
+              </w:rPr>
+            </w:pPr>
+          </w:p>
+        </w:tc>
+        <w:tc>
+          <w:tcPr>
+            <w:tcW w:w="2621" w:type="dxa"/>
+          </w:tcPr>
+          <w:p>
+            <w:pPr>
+              <w:rPr>
+                <w:rFonts w:ascii="Calibri" w:hAnsi="Calibri" w:cs="Calibri"/>
+                <w:sz w:val="20"/>
+                <w:szCs w:val="20"/>
+              </w:rPr>
+            </w:pPr>
+            <w:r>
+              <w:rPr>
+                <w:rFonts w:ascii="Calibri" w:hAnsi="Calibri" w:cs="Calibri"/>
+                <w:sz w:val="20"/>
+                <w:szCs w:val="20"/>
+              </w:rPr>
+              <w:t xml:space="preserve">Duplicated and reversed audio, then trimmed to add smaller unique giggles. </w:t>
+            </w:r>
+          </w:p>
+          <w:p>
+            <w:pPr>
+              <w:rPr>
+                <w:rFonts w:ascii="Calibri" w:hAnsi="Calibri" w:cs="Calibri"/>
+                <w:sz w:val="20"/>
+                <w:szCs w:val="20"/>
+              </w:rPr>
+            </w:pPr>
+          </w:p>
+          <w:p>
+            <w:pPr>
+              <w:rPr>
+                <w:rFonts w:ascii="Calibri" w:hAnsi="Calibri" w:cs="Calibri"/>
+                <w:sz w:val="20"/>
+                <w:szCs w:val="20"/>
+              </w:rPr>
+            </w:pPr>
+          </w:p>
+          <w:p>
+            <w:pPr>
+              <w:rPr>
+                <w:rFonts w:ascii="Calibri" w:hAnsi="Calibri" w:cs="Calibri"/>
+                <w:sz w:val="20"/>
+                <w:szCs w:val="20"/>
+              </w:rPr>
+            </w:pPr>
+            <w:r>
+              <w:rPr>
+                <w:rFonts w:ascii="Calibri" w:hAnsi="Calibri" w:cs="Calibri"/>
+                <w:sz w:val="20"/>
+                <w:szCs w:val="20"/>
+              </w:rPr>
+              <w:t>Duplicated again and altered pitch by -1 semitones.</w:t>
+            </w:r>
+          </w:p>
+          <w:p>
+            <w:pPr>
+              <w:rPr>
+                <w:rFonts w:ascii="Calibri" w:hAnsi="Calibri" w:cs="Calibri"/>
+                <w:sz w:val="20"/>
+                <w:szCs w:val="20"/>
+              </w:rPr>
+            </w:pPr>
+          </w:p>
+          <w:p>
+            <w:pPr>
+              <w:rPr>
+                <w:rFonts w:ascii="Calibri" w:hAnsi="Calibri" w:cs="Calibri"/>
+                <w:sz w:val="20"/>
+                <w:szCs w:val="20"/>
+              </w:rPr>
+            </w:pPr>
+            <w:r>
+              <w:rPr>
+                <w:rFonts w:ascii="Calibri" w:hAnsi="Calibri" w:cs="Calibri"/>
+                <w:sz w:val="20"/>
+                <w:szCs w:val="20"/>
+              </w:rPr>
+              <w:t>Duplicated longer laugh and inverted it and adjusted pitch</w:t>
+            </w:r>
+            <w:r>
+              <w:rPr>
+                <w:rFonts w:ascii="Calibri" w:hAnsi="Calibri" w:cs="Calibri"/>
+                <w:sz w:val="20"/>
+                <w:szCs w:val="20"/>
+              </w:rPr>
+              <w:t xml:space="preserve"> up</w:t>
+            </w:r>
+            <w:r>
+              <w:rPr>
+                <w:rFonts w:ascii="Calibri" w:hAnsi="Calibri" w:cs="Calibri"/>
+                <w:sz w:val="20"/>
+                <w:szCs w:val="20"/>
+              </w:rPr>
+              <w:t xml:space="preserve"> by 0.5 semitones.</w:t>
+            </w:r>
+          </w:p>
+          <w:p>
+            <w:pPr>
+              <w:rPr>
+                <w:rFonts w:ascii="Calibri" w:hAnsi="Calibri" w:cs="Calibri"/>
+                <w:sz w:val="20"/>
+                <w:szCs w:val="20"/>
+              </w:rPr>
+            </w:pPr>
+          </w:p>
+          <w:p>
+            <w:pPr>
+              <w:rPr>
+                <w:rFonts w:ascii="Calibri" w:hAnsi="Calibri" w:cs="Calibri"/>
+                <w:sz w:val="20"/>
+                <w:szCs w:val="20"/>
+              </w:rPr>
+            </w:pPr>
+            <w:r>
+              <w:rPr>
+                <w:rFonts w:ascii="Calibri" w:hAnsi="Calibri" w:cs="Calibri"/>
+                <w:sz w:val="20"/>
+                <w:szCs w:val="20"/>
+              </w:rPr>
+              <w:t xml:space="preserve">Enveloped one of the laughs which sounded too harsh: </w:t>
+            </w:r>
+          </w:p>
+          <w:p>
+            <w:pPr>
+              <w:rPr>
+                <w:rFonts w:ascii="Calibri" w:hAnsi="Calibri" w:cs="Calibri"/>
+                <w:sz w:val="20"/>
+                <w:szCs w:val="20"/>
+              </w:rPr>
+            </w:pPr>
+            <w:r>
+              <w:rPr>
+                <w:rFonts w:ascii="Calibri" w:hAnsi="Calibri" w:cs="Calibri"/>
+                <w:sz w:val="20"/>
+                <w:szCs w:val="20"/>
+              </w:rPr>
+              <w:drawing>
+                <wp:inline distT="0" distB="0" distL="0" distR="0" wp14:anchorId="7E58B6A1" wp14:editId="39BD09C5">
+                  <wp:extent cx="1527175" cy="857250"/>
+                  <wp:effectExtent l="0" t="0" r="0" b="0"/>
+                  <wp:docPr id="1566759894" name="Picture 1"/>
+                  <wp:cNvGraphicFramePr>
+                    <a:graphicFrameLocks xmlns:a="http://schemas.openxmlformats.org/drawingml/2006/main" noChangeAspect="1"/>
+                  </wp:cNvGraphicFramePr>
+                  <a:graphic xmlns:a="http://schemas.openxmlformats.org/drawingml/2006/main">
+                    <a:graphicData uri="http://schemas.openxmlformats.org/drawingml/2006/picture">
+                      <pic:pic xmlns:pic="http://schemas.openxmlformats.org/drawingml/2006/picture">
+                        <pic:nvPicPr>
+                          <pic:cNvPr id="1566759894" name=""/>
+                          <pic:cNvPicPr/>
+                        </pic:nvPicPr>
+                        <pic:blipFill rotWithShape="1">
+                          <a:blip r:embed="rId19"/>
+                          <a:srcRect t="21136" b="17501"/>
+                          <a:stretch>
+                            <a:fillRect/>
+                          </a:stretch>
+                        </pic:blipFill>
+                        <pic:spPr bwMode="auto">
+                          <a:xfrm>
+                            <a:off x="0" y="0"/>
+                            <a:ext cx="1527175" cy="857250"/>
+                          </a:xfrm>
+                          <a:prstGeom prst="rect">
+                            <a:avLst/>
+                          </a:prstGeom>
+                          <a:ln>
+                            <a:noFill/>
+                          </a:ln>
+                          <a:extLst>
+                            <a:ext uri="{53640926-AAD7-44D8-BBD7-CCE9431645EC}">
+                              <a14:shadowObscured xmlns:a14="http://schemas.microsoft.com/office/drawing/2010/main"/>
+                            </a:ext>
+                          </a:extLst>
+                        </pic:spPr>
+                      </pic:pic>
+                    </a:graphicData>
+                  </a:graphic>
+                </wp:inline>
+              </w:drawing>
+            </w:r>
+          </w:p>
+        </w:tc>
+        <w:tc>
+          <w:tcPr>
+            <w:tcW w:w="2621" w:type="dxa"/>
+          </w:tcPr>
+          <w:p>
+            <w:pPr>
+              <w:rPr>
+                <w:rFonts w:ascii="Calibri" w:hAnsi="Calibri" w:cs="Calibri"/>
+                <w:sz w:val="20"/>
+                <w:szCs w:val="20"/>
+              </w:rPr>
+            </w:pPr>
+            <w:r>
+              <w:rPr>
+                <w:rFonts w:ascii="Calibri" w:hAnsi="Calibri" w:cs="Calibri"/>
+                <w:sz w:val="20"/>
+                <w:szCs w:val="20"/>
+              </w:rPr>
+              <w:t>Slowed tempo down by 30%.</w:t>
+            </w:r>
+          </w:p>
+          <w:p>
+            <w:pPr>
+              <w:rPr>
+                <w:rFonts w:ascii="Calibri" w:hAnsi="Calibri" w:cs="Calibri"/>
+                <w:sz w:val="20"/>
+                <w:szCs w:val="20"/>
+              </w:rPr>
+            </w:pPr>
+          </w:p>
+          <w:p>
+            <w:pPr>
+              <w:rPr>
+                <w:rFonts w:ascii="Calibri" w:hAnsi="Calibri" w:cs="Calibri"/>
+                <w:sz w:val="20"/>
+                <w:szCs w:val="20"/>
+              </w:rPr>
+            </w:pPr>
+            <w:r>
+              <w:rPr>
+                <w:rFonts w:ascii="Calibri" w:hAnsi="Calibri" w:cs="Calibri"/>
+                <w:sz w:val="20"/>
+                <w:szCs w:val="20"/>
+              </w:rPr>
+              <w:t xml:space="preserve">Filter Curve EQ to boost middling pitches </w:t>
+            </w:r>
+            <w:r>
+              <w:rPr>
+                <w:rFonts w:ascii="Calibri" w:hAnsi="Calibri" w:cs="Calibri"/>
+                <w:sz w:val="20"/>
+                <w:szCs w:val="20"/>
+              </w:rPr>
+              <w:drawing>
+                <wp:inline distT="0" distB="0" distL="0" distR="0" wp14:anchorId="3EEF67DF" wp14:editId="0170A810">
+                  <wp:extent cx="1527175" cy="824230"/>
+                  <wp:effectExtent l="0" t="0" r="0" b="0"/>
+                  <wp:docPr id="1051650876" name="Picture 1"/>
+                  <wp:cNvGraphicFramePr>
+                    <a:graphicFrameLocks xmlns:a="http://schemas.openxmlformats.org/drawingml/2006/main" noChangeAspect="1"/>
+                  </wp:cNvGraphicFramePr>
+                  <a:graphic xmlns:a="http://schemas.openxmlformats.org/drawingml/2006/main">
+                    <a:graphicData uri="http://schemas.openxmlformats.org/drawingml/2006/picture">
+                      <pic:pic xmlns:pic="http://schemas.openxmlformats.org/drawingml/2006/picture">
+                        <pic:nvPicPr>
+                          <pic:cNvPr id="1051650876" name=""/>
+                          <pic:cNvPicPr/>
+                        </pic:nvPicPr>
+                        <pic:blipFill>
+                          <a:blip r:embed="rId20"/>
+                          <a:stretch>
+                            <a:fillRect/>
+                          </a:stretch>
+                        </pic:blipFill>
+                        <pic:spPr>
+                          <a:xfrm>
+                            <a:off x="0" y="0"/>
+                            <a:ext cx="1527175" cy="824230"/>
+                          </a:xfrm>
+                          <a:prstGeom prst="rect">
+                            <a:avLst/>
+                          </a:prstGeom>
+                        </pic:spPr>
+                      </pic:pic>
+                    </a:graphicData>
+                  </a:graphic>
+                </wp:inline>
+              </w:drawing>
+            </w:r>
+          </w:p>
+          <w:p>
+            <w:pPr>
+              <w:rPr>
+                <w:rFonts w:ascii="Calibri" w:hAnsi="Calibri" w:cs="Calibri"/>
+                <w:sz w:val="20"/>
+                <w:szCs w:val="20"/>
+              </w:rPr>
+            </w:pPr>
+          </w:p>
+          <w:p>
+            <w:pPr>
+              <w:rPr>
+                <w:rFonts w:ascii="Calibri" w:hAnsi="Calibri" w:cs="Calibri"/>
+                <w:sz w:val="20"/>
+                <w:szCs w:val="20"/>
+              </w:rPr>
+            </w:pPr>
+            <w:r>
+              <w:rPr>
+                <w:rFonts w:ascii="Calibri" w:hAnsi="Calibri" w:cs="Calibri"/>
+                <w:sz w:val="20"/>
+                <w:szCs w:val="20"/>
+              </w:rPr>
+              <w:t xml:space="preserve">Amplified the quieter giggles by 3 </w:t>
+            </w:r>
+            <w:proofErr w:type="spellStart"/>
+            <w:r>
+              <w:rPr>
+                <w:rFonts w:ascii="Calibri" w:hAnsi="Calibri" w:cs="Calibri"/>
+                <w:sz w:val="20"/>
+                <w:szCs w:val="20"/>
+              </w:rPr>
+              <w:t>d</w:t>
+            </w:r>
+            <w:r>
+              <w:rPr>
+                <w:rFonts w:ascii="Calibri" w:hAnsi="Calibri" w:cs="Calibri"/>
+                <w:sz w:val="20"/>
+                <w:szCs w:val="20"/>
+              </w:rPr>
+              <w:t>B</w:t>
+            </w:r>
+            <w:r>
+              <w:rPr>
+                <w:rFonts w:ascii="Calibri" w:hAnsi="Calibri" w:cs="Calibri"/>
+                <w:sz w:val="20"/>
+                <w:szCs w:val="20"/>
+              </w:rPr>
+              <w:t>.</w:t>
+            </w:r>
+            <w:proofErr w:type="spellEnd"/>
+          </w:p>
+          <w:p>
+            <w:pPr>
+              <w:rPr>
+                <w:rFonts w:ascii="Calibri" w:hAnsi="Calibri" w:cs="Calibri"/>
+                <w:sz w:val="20"/>
+                <w:szCs w:val="20"/>
+              </w:rPr>
+            </w:pPr>
+          </w:p>
+        </w:tc>
+        <w:tc>
+          <w:tcPr>
+            <w:tcW w:w="2622" w:type="dxa"/>
+          </w:tcPr>
+          <w:p>
+            <w:pPr>
+              <w:rPr>
+                <w:rFonts w:ascii="Calibri" w:hAnsi="Calibri" w:cs="Calibri"/>
+                <w:sz w:val="20"/>
+                <w:szCs w:val="20"/>
+              </w:rPr>
+            </w:pPr>
+            <w:r>
+              <w:rPr>
+                <w:rFonts w:ascii="Calibri" w:hAnsi="Calibri" w:cs="Calibri"/>
+                <w:sz w:val="20"/>
+                <w:szCs w:val="20"/>
+              </w:rPr>
+              <w:t>Sound of a “tiny creature” laughing</w:t>
+            </w:r>
+          </w:p>
+        </w:tc>
+      </w:tr>
+      <w:tr>
+        <w:tc>
+          <w:tcPr>
             <w:tcW w:w="2621" w:type="dxa"/>
           </w:tcPr>
           <w:p>
@@ -2720,6 +3928,7 @@
                 <w:sz w:val="20"/>
                 <w:szCs w:val="20"/>
               </w:rPr>
+              <w:lastRenderedPageBreak/>
               <w:t xml:space="preserve">Identify the source of the file (include a URL to the original file). </w:t>
             </w:r>
           </w:p>
@@ -2923,6 +4132,56 @@
     </w:sectPr>
   </w:body>
 </w:document>
+</file>
+
+<file path=word/endnotes.xml><?xml version="1.0" encoding="utf-8"?>
+<w:endnotes xmlns:wpc="http://schemas.microsoft.com/office/word/2010/wordprocessingCanvas" xmlns:cx="http://schemas.microsoft.com/office/drawing/2014/chartex" xmlns:cx1="http://schemas.microsoft.com/office/drawing/2015/9/8/chartex" xmlns:cx2="http://schemas.microsoft.com/office/drawing/2015/10/21/chartex" xmlns:cx3="http://schemas.microsoft.com/office/drawing/2016/5/9/chartex" xmlns:cx4="http://schemas.microsoft.com/office/drawing/2016/5/10/chartex" xmlns:cx5="http://schemas.microsoft.com/office/drawing/2016/5/11/chartex" xmlns:cx6="http://schemas.microsoft.com/office/drawing/2016/5/12/chartex" xmlns:cx7="http://schemas.microsoft.com/office/drawing/2016/5/13/chartex" xmlns:cx8="http://schemas.microsoft.com/office/drawing/2016/5/14/chartex" xmlns:mc="http://schemas.openxmlformats.org/markup-compatibility/2006" xmlns:aink="http://schemas.microsoft.com/office/drawing/2016/ink" xmlns:am3d="http://schemas.microsoft.com/office/drawing/2017/model3d" xmlns:o="urn:schemas-microsoft-com:office:office" xmlns:oel="http://schemas.microsoft.com/office/2019/extlst" xmlns:r="http://schemas.openxmlformats.org/officeDocument/2006/relationships" xmlns:m="http://schemas.openxmlformats.org/officeDocument/2006/math" xmlns:v="urn:schemas-microsoft-com:vml" xmlns:wp14="http://schemas.microsoft.com/office/word/2010/wordprocessingDrawing" xmlns:wp="http://schemas.openxmlformats.org/drawingml/2006/wordprocessingDrawing" xmlns:w10="urn:schemas-microsoft-com:office:word" xmlns:w="http://schemas.openxmlformats.org/wordprocessingml/2006/main" xmlns:w14="http://schemas.microsoft.com/office/word/2010/wordml" xmlns:w15="http://schemas.microsoft.com/office/word/2012/wordml" xmlns:w16cex="http://schemas.microsoft.com/office/word/2018/wordml/cex" xmlns:w16cid="http://schemas.microsoft.com/office/word/2016/wordml/cid" xmlns:w16="http://schemas.microsoft.com/office/word/2018/wordml" xmlns:w16du="http://schemas.microsoft.com/office/word/2023/wordml/word16du" xmlns:w16sdtdh="http://schemas.microsoft.com/office/word/2020/wordml/sdtdatahash" xmlns:w16sdtfl="http://schemas.microsoft.com/office/word/2024/wordml/sdtformatlock" xmlns:w16se="http://schemas.microsoft.com/office/word/2015/wordml/symex" xmlns:wpg="http://schemas.microsoft.com/office/word/2010/wordprocessingGroup" xmlns:wpi="http://schemas.microsoft.com/office/word/2010/wordprocessingInk" xmlns:wne="http://schemas.microsoft.com/office/word/2006/wordml" xmlns:wps="http://schemas.microsoft.com/office/word/2010/wordprocessingShape" mc:Ignorable="w14 w15 w16se w16cid w16 w16cex w16sdtdh w16sdtfl w16du wp14">
+  <w:endnote w:type="separator" w:id="-1">
+    <w:p>
+      <w:pPr>
+        <w:spacing w:after="0" w:line="240" w:lineRule="auto"/>
+      </w:pPr>
+      <w:r>
+        <w:separator/>
+      </w:r>
+    </w:p>
+  </w:endnote>
+  <w:endnote w:type="continuationSeparator" w:id="0">
+    <w:p>
+      <w:pPr>
+        <w:spacing w:after="0" w:line="240" w:lineRule="auto"/>
+      </w:pPr>
+      <w:r>
+        <w:continuationSeparator/>
+      </w:r>
+    </w:p>
+  </w:endnote>
+</w:endnotes>
+</file>
+
+<file path=word/footnotes.xml><?xml version="1.0" encoding="utf-8"?>
+<w:footnotes xmlns:wpc="http://schemas.microsoft.com/office/word/2010/wordprocessingCanvas" xmlns:cx="http://schemas.microsoft.com/office/drawing/2014/chartex" xmlns:cx1="http://schemas.microsoft.com/office/drawing/2015/9/8/chartex" xmlns:cx2="http://schemas.microsoft.com/office/drawing/2015/10/21/chartex" xmlns:cx3="http://schemas.microsoft.com/office/drawing/2016/5/9/chartex" xmlns:cx4="http://schemas.microsoft.com/office/drawing/2016/5/10/chartex" xmlns:cx5="http://schemas.microsoft.com/office/drawing/2016/5/11/chartex" xmlns:cx6="http://schemas.microsoft.com/office/drawing/2016/5/12/chartex" xmlns:cx7="http://schemas.microsoft.com/office/drawing/2016/5/13/chartex" xmlns:cx8="http://schemas.microsoft.com/office/drawing/2016/5/14/chartex" xmlns:mc="http://schemas.openxmlformats.org/markup-compatibility/2006" xmlns:aink="http://schemas.microsoft.com/office/drawing/2016/ink" xmlns:am3d="http://schemas.microsoft.com/office/drawing/2017/model3d" xmlns:o="urn:schemas-microsoft-com:office:office" xmlns:oel="http://schemas.microsoft.com/office/2019/extlst" xmlns:r="http://schemas.openxmlformats.org/officeDocument/2006/relationships" xmlns:m="http://schemas.openxmlformats.org/officeDocument/2006/math" xmlns:v="urn:schemas-microsoft-com:vml" xmlns:wp14="http://schemas.microsoft.com/office/word/2010/wordprocessingDrawing" xmlns:wp="http://schemas.openxmlformats.org/drawingml/2006/wordprocessingDrawing" xmlns:w10="urn:schemas-microsoft-com:office:word" xmlns:w="http://schemas.openxmlformats.org/wordprocessingml/2006/main" xmlns:w14="http://schemas.microsoft.com/office/word/2010/wordml" xmlns:w15="http://schemas.microsoft.com/office/word/2012/wordml" xmlns:w16cex="http://schemas.microsoft.com/office/word/2018/wordml/cex" xmlns:w16cid="http://schemas.microsoft.com/office/word/2016/wordml/cid" xmlns:w16="http://schemas.microsoft.com/office/word/2018/wordml" xmlns:w16du="http://schemas.microsoft.com/office/word/2023/wordml/word16du" xmlns:w16sdtdh="http://schemas.microsoft.com/office/word/2020/wordml/sdtdatahash" xmlns:w16sdtfl="http://schemas.microsoft.com/office/word/2024/wordml/sdtformatlock" xmlns:w16se="http://schemas.microsoft.com/office/word/2015/wordml/symex" xmlns:wpg="http://schemas.microsoft.com/office/word/2010/wordprocessingGroup" xmlns:wpi="http://schemas.microsoft.com/office/word/2010/wordprocessingInk" xmlns:wne="http://schemas.microsoft.com/office/word/2006/wordml" xmlns:wps="http://schemas.microsoft.com/office/word/2010/wordprocessingShape" mc:Ignorable="w14 w15 w16se w16cid w16 w16cex w16sdtdh w16sdtfl w16du wp14">
+  <w:footnote w:type="separator" w:id="-1">
+    <w:p>
+      <w:pPr>
+        <w:spacing w:after="0" w:line="240" w:lineRule="auto"/>
+      </w:pPr>
+      <w:r>
+        <w:separator/>
+      </w:r>
+    </w:p>
+  </w:footnote>
+  <w:footnote w:type="continuationSeparator" w:id="0">
+    <w:p>
+      <w:pPr>
+        <w:spacing w:after="0" w:line="240" w:lineRule="auto"/>
+      </w:pPr>
+      <w:r>
+        <w:continuationSeparator/>
+      </w:r>
+    </w:p>
+  </w:footnote>
+</w:footnotes>
 </file>
 
 <file path=word/styles.xml><?xml version="1.0" encoding="utf-8"?>
@@ -3325,7 +4584,7 @@
   <w:style w:type="paragraph" w:default="1" w:styleId="Normal">
     <w:name w:val="Normal"/>
     <w:qFormat/>
-    <w:rsid w:val="00973923"/>
+    <w:rsid w:val="00A639B8"/>
   </w:style>
   <w:style w:type="paragraph" w:styleId="Heading1">
     <w:name w:val="heading 1"/>
@@ -3862,6 +5121,73 @@
       </w:tblBorders>
     </w:tblPr>
   </w:style>
+  <w:style w:type="paragraph" w:styleId="Header">
+    <w:name w:val="header"/>
+    <w:basedOn w:val="Normal"/>
+    <w:link w:val="HeaderChar"/>
+    <w:uiPriority w:val="99"/>
+    <w:unhideWhenUsed/>
+    <w:rsid w:val="00A639B8"/>
+    <w:pPr>
+      <w:tabs>
+        <w:tab w:val="center" w:pos="4513"/>
+        <w:tab w:val="right" w:pos="9026"/>
+      </w:tabs>
+      <w:spacing w:after="0" w:line="240" w:lineRule="auto"/>
+    </w:pPr>
+  </w:style>
+  <w:style w:type="character" w:customStyle="1" w:styleId="HeaderChar">
+    <w:name w:val="Header Char"/>
+    <w:basedOn w:val="DefaultParagraphFont"/>
+    <w:link w:val="Header"/>
+    <w:uiPriority w:val="99"/>
+    <w:rsid w:val="00A639B8"/>
+  </w:style>
+  <w:style w:type="paragraph" w:styleId="Footer">
+    <w:name w:val="footer"/>
+    <w:basedOn w:val="Normal"/>
+    <w:link w:val="FooterChar"/>
+    <w:uiPriority w:val="99"/>
+    <w:unhideWhenUsed/>
+    <w:rsid w:val="00A639B8"/>
+    <w:pPr>
+      <w:tabs>
+        <w:tab w:val="center" w:pos="4513"/>
+        <w:tab w:val="right" w:pos="9026"/>
+      </w:tabs>
+      <w:spacing w:after="0" w:line="240" w:lineRule="auto"/>
+    </w:pPr>
+  </w:style>
+  <w:style w:type="character" w:customStyle="1" w:styleId="FooterChar">
+    <w:name w:val="Footer Char"/>
+    <w:basedOn w:val="DefaultParagraphFont"/>
+    <w:link w:val="Footer"/>
+    <w:uiPriority w:val="99"/>
+    <w:rsid w:val="00A639B8"/>
+  </w:style>
+  <w:style w:type="character" w:styleId="Hyperlink">
+    <w:name w:val="Hyperlink"/>
+    <w:basedOn w:val="DefaultParagraphFont"/>
+    <w:uiPriority w:val="99"/>
+    <w:unhideWhenUsed/>
+    <w:rsid w:val="00311BA9"/>
+    <w:rPr>
+      <w:color w:val="467886" w:themeColor="hyperlink"/>
+      <w:u w:val="single"/>
+    </w:rPr>
+  </w:style>
+  <w:style w:type="character" w:styleId="UnresolvedMention">
+    <w:name w:val="Unresolved Mention"/>
+    <w:basedOn w:val="DefaultParagraphFont"/>
+    <w:uiPriority w:val="99"/>
+    <w:semiHidden/>
+    <w:unhideWhenUsed/>
+    <w:rsid w:val="00311BA9"/>
+    <w:rPr>
+      <w:color w:val="605E5C"/>
+      <w:shd w:val="clear" w:color="auto" w:fill="E1DFDD"/>
+    </w:rPr>
+  </w:style>
 </w:styles>
 </file>
 

</xml_diff>

<commit_message>
Added Slides + Script
</commit_message>
<xml_diff>
--- a/Assessment/Track Sheet.docx
+++ b/Assessment/Track Sheet.docx
@@ -2301,31 +2301,6 @@
                 <w:szCs w:val="20"/>
               </w:rPr>
             </w:pPr>
-            <w:r>
-              <w:rPr>
-                <w:rFonts w:ascii="Calibri" w:hAnsi="Calibri" w:cs="Calibri"/>
-                <w:sz w:val="20"/>
-                <w:szCs w:val="20"/>
-              </w:rPr>
-              <w:t xml:space="preserve">Duplicated clip with +-0.5 semitone pitch difference. </w:t>
-            </w:r>
-          </w:p>
-          <w:p>
-            <w:pPr>
-              <w:rPr>
-                <w:rFonts w:ascii="Calibri" w:hAnsi="Calibri" w:cs="Calibri"/>
-                <w:sz w:val="20"/>
-                <w:szCs w:val="20"/>
-              </w:rPr>
-            </w:pPr>
-            <w:r>
-              <w:rPr>
-                <w:rFonts w:ascii="Calibri" w:hAnsi="Calibri" w:cs="Calibri"/>
-                <w:sz w:val="20"/>
-                <w:szCs w:val="20"/>
-              </w:rPr>
-              <w:t>(Randomly plays one of these when picking up the coin to avoid repetitive sound)</w:t>
-            </w:r>
           </w:p>
         </w:tc>
         <w:tc>
@@ -5307,47 +5282,7 @@
                 <w:sz w:val="20"/>
                 <w:szCs w:val="20"/>
               </w:rPr>
-              <w:t xml:space="preserve">Duplicated clip and panned one clip </w:t>
-            </w:r>
-            <w:r>
-              <w:rPr>
-                <w:rFonts w:ascii="Calibri" w:hAnsi="Calibri" w:cs="Calibri"/>
-                <w:sz w:val="20"/>
-                <w:szCs w:val="20"/>
-              </w:rPr>
-              <w:t>5</w:t>
-            </w:r>
-            <w:r>
-              <w:rPr>
-                <w:rFonts w:ascii="Calibri" w:hAnsi="Calibri" w:cs="Calibri"/>
-                <w:sz w:val="20"/>
-                <w:szCs w:val="20"/>
-              </w:rPr>
-              <w:t xml:space="preserve">0% to the left and the other </w:t>
-            </w:r>
-            <w:r>
-              <w:rPr>
-                <w:rFonts w:ascii="Calibri" w:hAnsi="Calibri" w:cs="Calibri"/>
-                <w:sz w:val="20"/>
-                <w:szCs w:val="20"/>
-              </w:rPr>
-              <w:t>5</w:t>
-            </w:r>
-            <w:r>
-              <w:rPr>
-                <w:rFonts w:ascii="Calibri" w:hAnsi="Calibri" w:cs="Calibri"/>
-                <w:sz w:val="20"/>
-                <w:szCs w:val="20"/>
-              </w:rPr>
-              <w:t>0% to the right, then combined the clips into a stereo file</w:t>
-            </w:r>
-            <w:r>
-              <w:rPr>
-                <w:rFonts w:ascii="Calibri" w:hAnsi="Calibri" w:cs="Calibri"/>
-                <w:sz w:val="20"/>
-                <w:szCs w:val="20"/>
-              </w:rPr>
-              <w:t xml:space="preserve"> to give the audio a more ambient feel.</w:t>
+              <w:t>Duplicated clip and panned one clip 50% to the left and the other 50% to the right, then combined the clips into a stereo file to give the audio a more ambient feel.</w:t>
             </w:r>
           </w:p>
           <w:p>
@@ -5444,6 +5379,7 @@
             <w:r>
               <w:rPr>
                 <w:rFonts w:ascii="Calibri" w:hAnsi="Calibri" w:cs="Calibri"/>
+                <w:noProof/>
                 <w:sz w:val="20"/>
                 <w:szCs w:val="20"/>
               </w:rPr>
@@ -5556,6 +5492,7 @@
             <w:r>
               <w:rPr>
                 <w:rFonts w:ascii="Calibri" w:hAnsi="Calibri" w:cs="Calibri"/>
+                <w:noProof/>
                 <w:sz w:val="20"/>
                 <w:szCs w:val="20"/>
               </w:rPr>
@@ -5625,6 +5562,7 @@
             <w:r>
               <w:rPr>
                 <w:rFonts w:ascii="Calibri" w:hAnsi="Calibri" w:cs="Calibri"/>
+                <w:noProof/>
                 <w:sz w:val="20"/>
                 <w:szCs w:val="20"/>
               </w:rPr>
@@ -6531,6 +6469,7 @@
   <w:style w:type="character" w:default="1" w:styleId="DefaultParagraphFont">
     <w:name w:val="Default Paragraph Font"/>
     <w:uiPriority w:val="1"/>
+    <w:semiHidden/>
     <w:unhideWhenUsed/>
   </w:style>
   <w:style w:type="table" w:default="1" w:styleId="TableNormal">

</xml_diff>